<commit_message>
fix(privacy): align policy operator with SIDcloud company profile
</commit_message>
<xml_diff>
--- a/docs/privacy-policy/纪元急袭隐私政策.docx
+++ b/docs/privacy-policy/纪元急袭隐私政策.docx
@@ -154,7 +154,7 @@
           <w:b/>
           <w:color w:val="000000"/>
         </w:rPr>
-        <w:t xml:space="preserve">更新日期：2026年10月8日</w:t>
+        <w:t xml:space="preserve">更新日期：2026年10月9日</w:t>
       </w:r>
     </w:p>
     <w:p>
@@ -174,7 +174,7 @@
           <w:b/>
           <w:color w:val="000000"/>
         </w:rPr>
-        <w:t xml:space="preserve">生效日期：2026年10月8日</w:t>
+        <w:t xml:space="preserve">生效日期：2026年10月9日</w:t>
       </w:r>
     </w:p>
     <w:p>
@@ -194,7 +194,7 @@
           <w:b/>
           <w:color w:val="000000"/>
         </w:rPr>
-        <w:t xml:space="preserve">政策版本：ER-PRIVACY-2026-10-08</w:t>
+        <w:t xml:space="preserve">政策版本：ER-PRIVACY-2026-10-09</w:t>
       </w:r>
     </w:p>
     <w:p>
@@ -242,26 +242,26 @@
           <w:lang w:eastAsia="zh-CN"/>
           <w:color w:val="000000"/>
         </w:rPr>
-        <w:t xml:space="preserve">《纪元急袭》的开发者及运营者对外名称为Wikig's Room（项目发布账号 wikigsroom），以下简称“我们”。本政策说明我们在提供游戏、处理主动联系请求及提供本隐私说明网页时，如何处理信息以及您如何行使权利。隐私联系邮箱：carzyg@outlook.com。</w:t>
-      </w:r>
-    </w:p>
-    <w:p>
-      <w:pPr>
-        <w:adjustRightInd w:val="0"/>
-        <w:snapToGrid w:val="0"/>
-        <w:spacing w:before="0" w:after="156" w:afterLines="50" w:line="360" w:lineRule="auto"/>
-        <w:rPr>
-          <w:rFonts w:ascii="Times New Roman" w:hAnsi="Times New Roman" w:eastAsia="华文仿宋" w:cs="Times New Roman"/>
-        </w:rPr>
-        <w:widowControl w:val="1"/>
-      </w:pPr>
-      <w:r>
-        <w:rPr>
-          <w:rFonts w:hint="eastAsia" w:ascii="Times New Roman" w:hAnsi="Times New Roman" w:eastAsia="华文仿宋" w:cs="Times New Roman"/>
-          <w:lang w:eastAsia="zh-CN"/>
-          <w:color w:val="000000"/>
-        </w:rPr>
-        <w:t xml:space="preserve">本政策适用于截至生效日的《纪元急袭》Godot 原生 Windows 与 Android 0.7.0 版本，以及发布本政策的网页。英文名称为 Epoch Rush: Pixel Command；Android 包名为 studio.epochrush.pixelcommand。其他发行渠道如另外增加登录、广告、支付或其他功能，应在启用前另行明确告知，不能直接沿用本政策中关于当前版本的描述。</w:t>
+        <w:t xml:space="preserve">《纪元急袭》的开发及运营主体为 SIDcloud，以下简称“我们”。本政策说明我们在提供游戏、处理主动联系请求及提供本隐私说明网页时，如何处理信息以及您如何行使权利。隐私联系邮箱：carzyg@outlook.com。</w:t>
+      </w:r>
+    </w:p>
+    <w:p>
+      <w:pPr>
+        <w:adjustRightInd w:val="0"/>
+        <w:snapToGrid w:val="0"/>
+        <w:spacing w:before="0" w:after="156" w:afterLines="50" w:line="360" w:lineRule="auto"/>
+        <w:rPr>
+          <w:rFonts w:ascii="Times New Roman" w:hAnsi="Times New Roman" w:eastAsia="华文仿宋" w:cs="Times New Roman"/>
+        </w:rPr>
+        <w:widowControl w:val="1"/>
+      </w:pPr>
+      <w:r>
+        <w:rPr>
+          <w:rFonts w:hint="eastAsia" w:ascii="Times New Roman" w:hAnsi="Times New Roman" w:eastAsia="华文仿宋" w:cs="Times New Roman"/>
+          <w:lang w:eastAsia="zh-CN"/>
+          <w:color w:val="000000"/>
+        </w:rPr>
+        <w:t xml:space="preserve">本政策适用于截至生效日的《纪元急袭》Godot 原生 Windows 与 Android 0.7.1 版本，以及发布本政策的网页。英文名称为 Epoch Rush: Pixel Command；Android 包名为 studio.epochrush.pixelcommand。其他发行渠道如另外增加登录、广告、支付或其他功能，应在启用前另行明确告知，不能直接沿用本政策中关于当前版本的描述。</w:t>
       </w:r>
     </w:p>
     <w:p>
@@ -2009,7 +2009,7 @@
           <w:lang w:eastAsia="zh-CN"/>
           <w:color w:val="000000"/>
         </w:rPr>
-        <w:t xml:space="preserve">当前 Android 0.7.0 发布包没有声明网络、定位、相机、麦克风、通讯录、电话状态或共享存储读取权限，不存在相应的运行时授权流程。读写本应用私有目录不需要授予共享存储权限；Windows 版仅使用操作系统赋予该程序的本机运行和文件读写能力。</w:t>
+        <w:t xml:space="preserve">当前 Android 0.7.1 发布包没有声明网络、定位、相机、麦克风、通讯录、电话状态或共享存储读取权限，不存在相应的运行时授权流程。读写本应用私有目录不需要授予共享存储权限；Windows 版仅使用操作系统赋予该程序的本机运行和文件读写能力。</w:t>
       </w:r>
     </w:p>
     <w:p>
@@ -3569,7 +3569,7 @@
           <w:lang w:eastAsia="zh-CN"/>
           <w:color w:val="000000"/>
         </w:rPr>
-        <w:t xml:space="preserve">我们会根据实际功能和适用规则更新本政策，在网页标明版本、更新和生效日期，并保留可核对的历史版本。请以您实际使用游戏版本对应的说明为准。当前网页初始版本为 ER-PRIVACY-2026-10-08，更新日期和生效日期均为 2026 年 10 月 8 日。</w:t>
+        <w:t xml:space="preserve">我们会根据实际功能和适用规则更新本政策，在网页标明版本、更新和生效日期，并保留可核对的历史版本。请以您实际使用游戏版本对应的说明为准。当前政策版本为 ER-PRIVACY-2026-10-09，更新日期和生效日期均为 2026 年 10 月 9 日。</w:t>
       </w:r>
     </w:p>
     <w:p>
@@ -3653,7 +3653,7 @@
           <w:lang w:eastAsia="zh-CN"/>
           <w:color w:val="000000"/>
         </w:rPr>
-        <w:t xml:space="preserve">开发者及运营者对外名称：Wikig's Room（项目发布账号 wikigsroom）。</w:t>
+        <w:t xml:space="preserve">开发及运营主体：SIDcloud。</w:t>
       </w:r>
     </w:p>
     <w:p>

</xml_diff>

<commit_message>
feat: add authoritative online PvP and native server release 0.8.0
</commit_message>
<xml_diff>
--- a/docs/privacy-policy/纪元急袭隐私政策.docx
+++ b/docs/privacy-policy/纪元急袭隐私政策.docx
@@ -37,7 +37,7 @@
           <w:rFonts w:hint="eastAsia" w:ascii="华文仿宋" w:hAnsi="华文仿宋" w:eastAsia="华文仿宋" w:cs="Times New Roman"/>
           <w:color w:val="000000"/>
         </w:rPr>
-        <w:t xml:space="preserve">欢迎使用《纪元急袭》。我们重视您的隐私。本提示概括当前版本的信息处理方式，请同时阅读后面的完整隐私政策。</w:t>
+        <w:t xml:space="preserve">欢迎使用《纪元急袭》。我们重视您的隐私。本提示概括 Windows 与 Android 0.8.0 版本的信息处理方式，请同时阅读完整隐私政策。</w:t>
       </w:r>
     </w:p>
     <w:p>
@@ -53,7 +53,7 @@
           <w:rFonts w:hint="eastAsia" w:ascii="华文仿宋" w:hAnsi="华文仿宋" w:eastAsia="华文仿宋" w:cs="Times New Roman"/>
           <w:color w:val="000000"/>
         </w:rPr>
-        <w:t xml:space="preserve">当前 Windows 和 Android 游戏是可离线运行的单人游戏，无需注册或登录。本机进度、设置和对战存档不会由游戏自动上传给开发者。</w:t>
+        <w:t xml:space="preserve">单人游戏可离线使用。本机进度、设置和单人存档不会自动上传。选择联机后，客户端连接您填写的对战服务器，创建随机匿名身份，并传输匹配、房间、构筑与对战数据以完成真人对战和断线恢复。</w:t>
       </w:r>
     </w:p>
     <w:p>
@@ -69,7 +69,7 @@
           <w:rFonts w:hint="eastAsia" w:ascii="华文仿宋" w:hAnsi="华文仿宋" w:eastAsia="华文仿宋" w:cs="Times New Roman"/>
           <w:color w:val="000000"/>
         </w:rPr>
-        <w:t xml:space="preserve">当前 Android 发布包未声明网络、定位、相机、麦克风、通讯录或共享存储访问权限，不会为这些权限弹出授权请求。游戏只在本机应用数据目录读写自身文件。</w:t>
+        <w:t xml:space="preserve">匿名身份不要求填写姓名、手机号或邮箱，也不读取硬件设备标识。身份密钥在 Windows 由 DPAPI、在 Android 由 Keystore 保护；服务器保存用于验证的密钥哈希。请勿向其他人提供身份密钥。</w:t>
       </w:r>
     </w:p>
     <w:p>
@@ -85,7 +85,7 @@
           <w:rFonts w:hint="eastAsia" w:ascii="华文仿宋" w:hAnsi="华文仿宋" w:eastAsia="华文仿宋" w:cs="Times New Roman"/>
           <w:color w:val="000000"/>
         </w:rPr>
-        <w:t xml:space="preserve">游戏未接入广告、统计、支付、账号登录或云存档 SDK，也不通过游戏收集姓名、手机号、身份证号、广告标识符或精确位置。</w:t>
+        <w:t xml:space="preserve">Android 0.8.0 声明正常网络权限 INTERNET，用于您选择的联机功能；该权限不产生运行时授权弹窗。游戏没有定位、相机、麦克风、通讯录、电话或共享存储读取权限。</w:t>
       </w:r>
     </w:p>
     <w:p>
@@ -101,7 +101,7 @@
           <w:rFonts w:hint="eastAsia" w:ascii="华文仿宋" w:hAnsi="华文仿宋" w:eastAsia="华文仿宋" w:cs="Times New Roman"/>
           <w:color w:val="000000"/>
         </w:rPr>
-        <w:t xml:space="preserve">当您主动联系开发者时，我们会处理您自愿提供的邮件地址、联系内容和附件，用于答复和解决问题；请勿发送身份证件、密码等不必要信息。</w:t>
+        <w:t xml:space="preserve">游戏未接入广告、行为统计、支付、社交登录或单机云存档 SDK。联机对手会看到主将、时代、兵线、基地和对局结果，不会收到您的私有金币、科技值、训练队列及私有技能冷却。</w:t>
       </w:r>
     </w:p>
     <w:p>
@@ -117,7 +117,7 @@
           <w:rFonts w:hint="eastAsia" w:ascii="华文仿宋" w:hAnsi="华文仿宋" w:eastAsia="华文仿宋" w:cs="Times New Roman"/>
           <w:color w:val="000000"/>
         </w:rPr>
-        <w:t xml:space="preserve">本隐私网页由 Vercel 托管。访问网页会产生 IP 地址等必要的网络请求信息，具体见第一、二、五节。这不会使游戏中的本机存档自动上传。</w:t>
+        <w:t xml:space="preserve">联机数据由您选择的服务器运营者处理。使用自行部署或他人的服务端前，请确认其身份、所在地和隐私规则；当前 Release 不附带已部署的公共匹配服务。公网连接要求 HTTPS/WSS，明文 HTTP 只用于本机或私有局域网。</w:t>
       </w:r>
     </w:p>
     <w:p>
@@ -133,7 +133,7 @@
           <w:rFonts w:hint="eastAsia" w:ascii="华文仿宋" w:hAnsi="华文仿宋" w:eastAsia="华文仿宋" w:cs="Times New Roman"/>
           <w:color w:val="000000"/>
         </w:rPr>
-        <w:t xml:space="preserve">您可以清除本机游戏数据，并就已向我们提供的信息行使查阅、更正、删除、撤回同意等权利。未成年人请与监护人一起阅读；涉及未满十四周岁儿童的联系请求，请由监护人提出。</w:t>
+        <w:t xml:space="preserve">您主动联系我们时，我们处理您提供的邮件及附件。隐私网页由 Vercel 托管，会产生必要的网页请求信息。您可以清除本机数据，并通过隐私联系邮箱请求查阅、更正或删除我们实际持有的信息。未成年人请与监护人一起阅读。</w:t>
       </w:r>
     </w:p>
     <w:p>
@@ -154,7 +154,7 @@
           <w:b/>
           <w:color w:val="000000"/>
         </w:rPr>
-        <w:t xml:space="preserve">更新日期：2026年10月9日</w:t>
+        <w:t xml:space="preserve">更新日期：2026年10月11日</w:t>
       </w:r>
     </w:p>
     <w:p>
@@ -174,7 +174,7 @@
           <w:b/>
           <w:color w:val="000000"/>
         </w:rPr>
-        <w:t xml:space="preserve">生效日期：2026年10月9日</w:t>
+        <w:t xml:space="preserve">生效日期：2026年10月11日</w:t>
       </w:r>
     </w:p>
     <w:p>
@@ -194,7 +194,7 @@
           <w:b/>
           <w:color w:val="000000"/>
         </w:rPr>
-        <w:t xml:space="preserve">政策版本：ER-PRIVACY-2026-10-09</w:t>
+        <w:t xml:space="preserve">政策版本：ER-PRIVACY-2026-10-11</w:t>
       </w:r>
     </w:p>
     <w:p>
@@ -261,7 +261,7 @@
           <w:lang w:eastAsia="zh-CN"/>
           <w:color w:val="000000"/>
         </w:rPr>
-        <w:t xml:space="preserve">本政策适用于截至生效日的《纪元急袭》Godot 原生 Windows 与 Android 0.7.1 版本，以及发布本政策的网页。英文名称为 Epoch Rush: Pixel Command；Android 包名为 studio.epochrush.pixelcommand。其他发行渠道如另外增加登录、广告、支付或其他功能，应在启用前另行明确告知，不能直接沿用本政策中关于当前版本的描述。</w:t>
+        <w:t xml:space="preserve">本政策适用于截至生效日《纪元急袭》Godot 原生 Windows 与 Android 0.8.0 版本及发布本政策的网页。英文名称为 Epoch Rush: Pixel Command，Android 包名为 studio.epochrush.pixelcommand。0.8.0 新增可选的真人联机功能；0.7.x 离线版本的信息处理方式请查阅仓库历史政策。使用他人部署的联机服务器时，该运营者独立承担其实际处理的信息保护责任，应另行向您告知规则。</w:t>
       </w:r>
     </w:p>
     <w:p>
@@ -1531,6 +1531,182 @@
                 <w:szCs w:val="20"/>
                 <w:color w:val="000000"/>
               </w:rPr>
+              <w:t>主动联机</w:t>
+            </w:r>
+          </w:p>
+        </w:tc>
+        <w:tc>
+          <w:tcPr>
+            <w:tcW w:w="2500" w:type="dxa"/>
+            <w:tcBorders>
+              <w:top w:val="single" w:color="DDDDDD" w:sz="6" w:space="0"/>
+              <w:left w:val="nil"/>
+              <w:bottom w:val="single" w:color="DDDDDD" w:sz="6" w:space="0"/>
+              <w:right w:val="single" w:color="DDDDDD" w:sz="6" w:space="0"/>
+            </w:tcBorders>
+            <w:shd w:val="clear" w:color="auto" w:fill="FFFFFF"/>
+            <w:tcMar>
+              <w:top w:w="105" w:type="dxa"/>
+              <w:left w:w="150" w:type="dxa"/>
+              <w:bottom w:w="105" w:type="dxa"/>
+              <w:right w:w="150" w:type="dxa"/>
+            </w:tcMar>
+            <w:vAlign w:val="center"/>
+          </w:tcPr>
+          <w:p>
+            <w:pPr>
+              <w:pStyle w:val="23"/>
+              <w:widowControl w:val="1"/>
+              <w:numPr>
+                <w:ilvl w:val="255"/>
+                <w:numId w:val="0"/>
+              </w:numPr>
+              <w:spacing w:before="90" w:after="90" w:line="260" w:lineRule="auto"/>
+              <w:ind w:firstLine="400" w:firstLineChars="200"/>
+              <w:jc w:val="left"/>
+              <w:rPr>
+                <w:rFonts w:hint="default" w:ascii="Times New Roman" w:hAnsi="Times New Roman" w:eastAsia="仿宋" w:cs="Arial"/>
+                <w:kern w:val="0"/>
+                <w:sz w:val="20"/>
+                <w:szCs w:val="20"/>
+                <w:lang w:val="en-US" w:eastAsia="zh-CN"/>
+              </w:rPr>
+              <w:keepNext w:val="1"/>
+            </w:pPr>
+            <w:r>
+              <w:rPr>
+                <w:rFonts w:ascii="Times New Roman" w:hAnsi="Times New Roman" w:eastAsia="华文仿宋"/>
+                <w:sz w:val="20"/>
+                <w:szCs w:val="20"/>
+                <w:color w:val="000000"/>
+              </w:rPr>
+              <w:t>随机匿名身份、构筑、匹配/房间信息、指令、战局与结果</w:t>
+            </w:r>
+          </w:p>
+        </w:tc>
+        <w:tc>
+          <w:tcPr>
+            <w:tcW w:w="2900" w:type="dxa"/>
+            <w:tcBorders>
+              <w:top w:val="single" w:color="DDDDDD" w:sz="6" w:space="0"/>
+              <w:left w:val="nil"/>
+              <w:bottom w:val="single" w:color="DDDDDD" w:sz="6" w:space="0"/>
+              <w:right w:val="single" w:color="DDDDDD" w:sz="6" w:space="0"/>
+            </w:tcBorders>
+            <w:shd w:val="clear" w:color="auto" w:fill="FFFFFF"/>
+            <w:tcMar>
+              <w:top w:w="105" w:type="dxa"/>
+              <w:left w:w="150" w:type="dxa"/>
+              <w:bottom w:w="105" w:type="dxa"/>
+              <w:right w:w="150" w:type="dxa"/>
+            </w:tcMar>
+            <w:vAlign w:val="center"/>
+          </w:tcPr>
+          <w:p>
+            <w:pPr>
+              <w:pStyle w:val="23"/>
+              <w:widowControl w:val="1"/>
+              <w:numPr>
+                <w:ilvl w:val="255"/>
+                <w:numId w:val="0"/>
+              </w:numPr>
+              <w:spacing w:before="90" w:after="90" w:line="260" w:lineRule="auto"/>
+              <w:jc w:val="left"/>
+              <w:rPr>
+                <w:rFonts w:ascii="Times New Roman" w:hAnsi="Times New Roman" w:eastAsia="仿宋" w:cs="Arial"/>
+                <w:sz w:val="20"/>
+                <w:szCs w:val="20"/>
+              </w:rPr>
+              <w:keepNext w:val="1"/>
+            </w:pPr>
+            <w:r>
+              <w:rPr>
+                <w:rFonts w:ascii="Times New Roman" w:hAnsi="Times New Roman" w:eastAsia="华文仿宋"/>
+                <w:sz w:val="20"/>
+                <w:szCs w:val="20"/>
+                <w:color w:val="000000"/>
+              </w:rPr>
+              <w:t>匹配、对战裁判与原局恢复；所选服务端</w:t>
+            </w:r>
+          </w:p>
+        </w:tc>
+        <w:tc>
+          <w:tcPr>
+            <w:tcW w:w="1556" w:type="dxa"/>
+            <w:tcBorders>
+              <w:top w:val="single" w:color="DDDDDD" w:sz="6" w:space="0"/>
+              <w:left w:val="nil"/>
+              <w:bottom w:val="single" w:color="DDDDDD" w:sz="6" w:space="0"/>
+              <w:right w:val="single" w:color="DDDDDD" w:sz="6" w:space="0"/>
+            </w:tcBorders>
+            <w:shd w:val="clear" w:color="auto" w:fill="FFFFFF"/>
+            <w:vAlign w:val="center"/>
+          </w:tcPr>
+          <w:p>
+            <w:pPr>
+              <w:widowControl w:val="1"/>
+              <w:spacing w:before="90" w:after="90" w:line="260" w:lineRule="auto"/>
+              <w:jc w:val="left"/>
+              <w:rPr>
+                <w:rFonts w:ascii="Times New Roman" w:hAnsi="Times New Roman" w:eastAsia="仿宋" w:cs="Arial"/>
+                <w:sz w:val="20"/>
+                <w:szCs w:val="20"/>
+              </w:rPr>
+              <w:keepNext w:val="1"/>
+            </w:pPr>
+            <w:r>
+              <w:rPr>
+                <w:rFonts w:ascii="Times New Roman" w:hAnsi="Times New Roman" w:eastAsia="华文仿宋"/>
+                <w:sz w:val="20"/>
+                <w:szCs w:val="20"/>
+                <w:color w:val="000000"/>
+              </w:rPr>
+              <w:t>选择连接后传输给所选服务器</w:t>
+            </w:r>
+          </w:p>
+        </w:tc>
+      </w:tr>
+      <w:tr>
+        <w:trPr>
+          <w:cantSplit/>
+        </w:trPr>
+        <w:tc>
+          <w:tcPr>
+            <w:tcW w:w="1350" w:type="dxa"/>
+            <w:tcBorders>
+              <w:top w:val="single" w:color="DDDDDD" w:sz="6" w:space="0"/>
+              <w:left w:val="single" w:color="DDDDDD" w:sz="6" w:space="0"/>
+              <w:bottom w:val="single" w:color="DDDDDD" w:sz="6" w:space="0"/>
+              <w:right w:val="single" w:color="DDDDDD" w:sz="6" w:space="0"/>
+            </w:tcBorders>
+            <w:shd w:val="clear" w:color="auto" w:fill="FFFFFF"/>
+            <w:tcMar>
+              <w:top w:w="105" w:type="dxa"/>
+              <w:left w:w="150" w:type="dxa"/>
+              <w:bottom w:w="105" w:type="dxa"/>
+              <w:right w:w="150" w:type="dxa"/>
+            </w:tcMar>
+            <w:vAlign w:val="center"/>
+          </w:tcPr>
+          <w:p>
+            <w:pPr>
+              <w:widowControl w:val="1"/>
+              <w:spacing w:before="90" w:after="90" w:line="260" w:lineRule="auto"/>
+              <w:jc w:val="left"/>
+              <w:rPr>
+                <w:rFonts w:ascii="Times New Roman" w:hAnsi="Times New Roman" w:eastAsia="仿宋" w:cs="Arial"/>
+                <w:sz w:val="20"/>
+                <w:szCs w:val="20"/>
+              </w:rPr>
+              <w:keepNext w:val="1"/>
+            </w:pPr>
+            <w:r>
+              <w:rPr>
+                <w:rFonts w:ascii="Times New Roman" w:hAnsi="Times New Roman" w:eastAsia="华文仿宋"/>
+                <w:sz w:val="20"/>
+                <w:szCs w:val="20"/>
+                <w:color w:val="000000"/>
+              </w:rPr>
               <w:t>主动联系</w:t>
             </w:r>
           </w:p>
@@ -1862,45 +2038,83 @@
           <w:lang w:val="en-US" w:eastAsia="zh-CN"/>
           <w:color w:val="000000"/>
         </w:rPr>
-        <w:t xml:space="preserve">2 主动联系与问题反馈</w:t>
-      </w:r>
-    </w:p>
-    <w:p>
-      <w:pPr>
-        <w:adjustRightInd w:val="0"/>
-        <w:snapToGrid w:val="0"/>
-        <w:spacing w:before="0" w:after="156" w:afterLines="50" w:line="360" w:lineRule="auto"/>
-        <w:rPr>
-          <w:rFonts w:ascii="Times New Roman" w:hAnsi="Times New Roman" w:eastAsia="华文仿宋" w:cs="Times New Roman"/>
-        </w:rPr>
-        <w:widowControl w:val="1"/>
-      </w:pPr>
-      <w:r>
-        <w:rPr>
-          <w:rFonts w:hint="eastAsia" w:ascii="Times New Roman" w:hAnsi="Times New Roman" w:eastAsia="华文仿宋" w:cs="Times New Roman"/>
-          <w:lang w:eastAsia="zh-CN"/>
-          <w:color w:val="000000"/>
-        </w:rPr>
-        <w:t xml:space="preserve">您通过隐私联系邮箱发送问题时，我们会接收您的邮件地址、联系内容及您主动发送的截图、日志或存档附件，并仅用于回复、问题排查或落实您的权利。提供附件并非游玩游戏的条件。请先删去附件中的姓名、账号、其他应用内容、设备用户名和路径等与问题无关的信息；不要发送身份证件、支付信息或密码。</w:t>
-      </w:r>
-    </w:p>
-    <w:p>
-      <w:pPr>
-        <w:adjustRightInd w:val="0"/>
-        <w:snapToGrid w:val="0"/>
-        <w:spacing w:before="0" w:after="156" w:afterLines="50" w:line="360" w:lineRule="auto"/>
-        <w:rPr>
-          <w:rFonts w:ascii="Times New Roman" w:hAnsi="Times New Roman" w:eastAsia="华文仿宋" w:cs="Times New Roman"/>
-        </w:rPr>
-        <w:widowControl w:val="1"/>
-      </w:pPr>
-      <w:r>
-        <w:rPr>
-          <w:rFonts w:hint="eastAsia" w:ascii="Times New Roman" w:hAnsi="Times New Roman" w:eastAsia="华文仿宋" w:cs="Times New Roman"/>
-          <w:lang w:eastAsia="zh-CN"/>
-          <w:color w:val="000000"/>
-        </w:rPr>
-        <w:t xml:space="preserve">我们不会自动获取整份存档或设备诊断日志。如排查需要进一步信息，我们会先说明用途和范围，您可以拒绝提供，拒绝不会影响离线游玩。您也可以仅咨询而不发送附件。</w:t>
+        <w:t xml:space="preserve">2 可选联机与断线恢复</w:t>
+      </w:r>
+    </w:p>
+    <w:p>
+      <w:pPr>
+        <w:adjustRightInd w:val="0"/>
+        <w:snapToGrid w:val="0"/>
+        <w:spacing w:before="0" w:after="156" w:afterLines="50" w:line="360" w:lineRule="auto"/>
+        <w:rPr>
+          <w:rFonts w:ascii="Times New Roman" w:hAnsi="Times New Roman" w:eastAsia="华文仿宋" w:cs="Times New Roman"/>
+        </w:rPr>
+        <w:widowControl w:val="1"/>
+      </w:pPr>
+      <w:r>
+        <w:rPr>
+          <w:rFonts w:hint="eastAsia" w:ascii="Times New Roman" w:hAnsi="Times New Roman" w:eastAsia="华文仿宋" w:cs="Times New Roman"/>
+          <w:lang w:eastAsia="zh-CN"/>
+          <w:color w:val="000000"/>
+        </w:rPr>
+        <w:t xml:space="preserve">您在联机菜单填写服务器地址并选择连接、创建房间或自由匹配时，客户端生成随机安装身份密钥并向该服务器验证，取得匿名玩家编号和短期访问令牌。密钥不是 IMEI、MAC、广告标识符或跨应用设备指纹；不同服务器分别保存身份凭据。首次连接会处理这些信息，您可选择只玩单机而不连接。已连接过的地址会保存在本机；存在尚未结束的在线对局时，重新启动应用会自动联系该服务器恢复原局。</w:t>
+      </w:r>
+    </w:p>
+    <w:p>
+      <w:pPr>
+        <w:adjustRightInd w:val="0"/>
+        <w:snapToGrid w:val="0"/>
+        <w:spacing w:before="0" w:after="156" w:afterLines="50" w:line="360" w:lineRule="auto"/>
+        <w:rPr>
+          <w:rFonts w:ascii="Times New Roman" w:hAnsi="Times New Roman" w:eastAsia="华文仿宋" w:cs="Times New Roman"/>
+        </w:rPr>
+        <w:widowControl w:val="1"/>
+      </w:pPr>
+      <w:r>
+        <w:rPr>
+          <w:rFonts w:hint="eastAsia" w:ascii="Times New Roman" w:hAnsi="Times New Roman" w:eastAsia="华文仿宋" w:cs="Times New Roman"/>
+          <w:lang w:eastAsia="zh-CN"/>
+          <w:color w:val="000000"/>
+        </w:rPr>
+        <w:t xml:space="preserve">联机服务处理匿名玩家编号、房间码、席位、准备状态、英雄与技能/遗物/天赋构筑、匹配等待时间、对局编号、指令与序号、模拟时间、战斗状态检查点及结果。服务器裁判需要处理双方完整对战状态以核算资源、攻击与时代升级；发送给对手的订阅会过滤您的私有资源、队列和私有冷却。在线比赛的对手可见必要的匿名编号、公开构筑、时代、场上单位、基地与胜负；本版没有文字聊天、通讯录、好友关系或真实姓名展示。</w:t>
+      </w:r>
+    </w:p>
+    <w:p>
+      <w:pPr>
+        <w:adjustRightInd w:val="0"/>
+        <w:snapToGrid w:val="0"/>
+        <w:spacing w:before="0" w:after="156" w:afterLines="50" w:line="360" w:lineRule="auto"/>
+        <w:rPr>
+          <w:rFonts w:ascii="Times New Roman" w:hAnsi="Times New Roman" w:eastAsia="华文仿宋" w:cs="Times New Roman"/>
+        </w:rPr>
+        <w:widowControl w:val="1"/>
+      </w:pPr>
+      <w:r>
+        <w:rPr>
+          <w:rFonts w:hint="eastAsia" w:ascii="Times New Roman" w:hAnsi="Times New Roman" w:eastAsia="华文仿宋" w:cs="Times New Roman"/>
+          <w:lang w:eastAsia="zh-CN"/>
+          <w:color w:val="000000"/>
+        </w:rPr>
+        <w:t xml:space="preserve">网络通信会使所选服务器及必要网络基础设施接触来源 IP、连接时间和必要协议数据。随本项目提供的网关对来源地址的限流标识只在内存短期保存，默认应用日志不输出身份密钥、访问令牌或完整指令正文；自行配置的代理访问日志、监控、备份或其他服务由实际运营者说明。Windows 和 Android 单机进度与单机存档不因选择联机而上传，线上比赛也不上传您的本机历史战绩。</w:t>
+      </w:r>
+    </w:p>
+    <w:p>
+      <w:pPr>
+        <w:adjustRightInd w:val="0"/>
+        <w:snapToGrid w:val="0"/>
+        <w:spacing w:before="0" w:after="156" w:afterLines="50" w:line="360" w:lineRule="auto"/>
+        <w:rPr>
+          <w:rFonts w:ascii="Times New Roman" w:hAnsi="Times New Roman" w:eastAsia="华文仿宋" w:cs="Times New Roman"/>
+        </w:rPr>
+        <w:widowControl w:val="1"/>
+      </w:pPr>
+      <w:r>
+        <w:rPr>
+          <w:rFonts w:hint="eastAsia" w:ascii="Times New Roman" w:hAnsi="Times New Roman" w:eastAsia="华文仿宋" w:cs="Times New Roman"/>
+          <w:lang w:eastAsia="zh-CN"/>
+          <w:color w:val="000000"/>
+        </w:rPr>
+        <w:t xml:space="preserve">联机只向您选择的服务器发送必要数据，不提供游戏内注册表单或单机云存档。联机菜单提供本政策链接及匿名身份用途说明。公网地址须为 HTTPS 并通过 WSS 传输战局；本机或私有局域网 HTTP 连接未额外加密，请仅在您信任的网络使用。结束对局后可停止联机使用；切换或清除服务器地址不等于删除该服务器已经保存的数据。</w:t>
       </w:r>
     </w:p>
     <w:p>
@@ -1926,45 +2140,45 @@
           <w:lang w:val="en-US" w:eastAsia="zh-CN"/>
           <w:color w:val="000000"/>
         </w:rPr>
-        <w:t xml:space="preserve">3 隐私网页的网络请求</w:t>
-      </w:r>
-    </w:p>
-    <w:p>
-      <w:pPr>
-        <w:adjustRightInd w:val="0"/>
-        <w:snapToGrid w:val="0"/>
-        <w:spacing w:before="0" w:after="156" w:afterLines="50" w:line="360" w:lineRule="auto"/>
-        <w:rPr>
-          <w:rFonts w:ascii="Times New Roman" w:hAnsi="Times New Roman" w:eastAsia="华文仿宋" w:cs="Times New Roman"/>
-        </w:rPr>
-        <w:widowControl w:val="1"/>
-      </w:pPr>
-      <w:r>
-        <w:rPr>
-          <w:rFonts w:hint="eastAsia" w:ascii="Times New Roman" w:hAnsi="Times New Roman" w:eastAsia="华文仿宋" w:cs="Times New Roman"/>
-          <w:lang w:eastAsia="zh-CN"/>
-          <w:color w:val="000000"/>
-        </w:rPr>
-        <w:t xml:space="preserve">您使用浏览器访问本政策网页时，浏览器会向 Vercel 托管服务发出请求。为传输页面和防范攻击，服务会处理 IP 地址、请求时间、请求 URL、浏览器发送的请求头及系统配置等技术信息，并可能依据 IP 推断城市或国家等大致地域；这不是游戏获取 GPS 精确定位。页面未启用 Vercel Web Analytics、Speed Insights、广告追踪或其他访问统计脚本，也不提供收集信息的在线表单。</w:t>
-      </w:r>
-    </w:p>
-    <w:p>
-      <w:pPr>
-        <w:adjustRightInd w:val="0"/>
-        <w:snapToGrid w:val="0"/>
-        <w:spacing w:before="0" w:after="156" w:afterLines="50" w:line="360" w:lineRule="auto"/>
-        <w:rPr>
-          <w:rFonts w:ascii="Times New Roman" w:hAnsi="Times New Roman" w:eastAsia="华文仿宋" w:cs="Times New Roman"/>
-        </w:rPr>
-        <w:widowControl w:val="1"/>
-      </w:pPr>
-      <w:r>
-        <w:rPr>
-          <w:rFonts w:hint="eastAsia" w:ascii="Times New Roman" w:hAnsi="Times New Roman" w:eastAsia="华文仿宋" w:cs="Times New Roman"/>
-          <w:lang w:eastAsia="zh-CN"/>
-          <w:color w:val="000000"/>
-        </w:rPr>
-        <w:t xml:space="preserve">只在您打开网页时发生上述网络处理；离线启动游戏不等同于访问网页。请勿把个人信息写入网页 URL 查询参数。网站访问技术信息不会与您的游戏进度、阵容或战绩关联。</w:t>
+        <w:t xml:space="preserve">3 主动联系与问题反馈</w:t>
+      </w:r>
+    </w:p>
+    <w:p>
+      <w:pPr>
+        <w:adjustRightInd w:val="0"/>
+        <w:snapToGrid w:val="0"/>
+        <w:spacing w:before="0" w:after="156" w:afterLines="50" w:line="360" w:lineRule="auto"/>
+        <w:rPr>
+          <w:rFonts w:ascii="Times New Roman" w:hAnsi="Times New Roman" w:eastAsia="华文仿宋" w:cs="Times New Roman"/>
+        </w:rPr>
+        <w:widowControl w:val="1"/>
+      </w:pPr>
+      <w:r>
+        <w:rPr>
+          <w:rFonts w:hint="eastAsia" w:ascii="Times New Roman" w:hAnsi="Times New Roman" w:eastAsia="华文仿宋" w:cs="Times New Roman"/>
+          <w:lang w:eastAsia="zh-CN"/>
+          <w:color w:val="000000"/>
+        </w:rPr>
+        <w:t xml:space="preserve">您通过隐私联系邮箱发送问题时，我们会接收您的邮件地址、联系内容及您主动发送的截图、日志或存档附件，并仅用于回复、问题排查或落实您的权利。提供附件并非游玩游戏的条件。请先删去附件中的姓名、账号、其他应用内容、设备用户名和路径等与问题无关的信息；不要发送身份证件、支付信息或密码。</w:t>
+      </w:r>
+    </w:p>
+    <w:p>
+      <w:pPr>
+        <w:adjustRightInd w:val="0"/>
+        <w:snapToGrid w:val="0"/>
+        <w:spacing w:before="0" w:after="156" w:afterLines="50" w:line="360" w:lineRule="auto"/>
+        <w:rPr>
+          <w:rFonts w:ascii="Times New Roman" w:hAnsi="Times New Roman" w:eastAsia="华文仿宋" w:cs="Times New Roman"/>
+        </w:rPr>
+        <w:widowControl w:val="1"/>
+      </w:pPr>
+      <w:r>
+        <w:rPr>
+          <w:rFonts w:hint="eastAsia" w:ascii="Times New Roman" w:hAnsi="Times New Roman" w:eastAsia="华文仿宋" w:cs="Times New Roman"/>
+          <w:lang w:eastAsia="zh-CN"/>
+          <w:color w:val="000000"/>
+        </w:rPr>
+        <w:t xml:space="preserve">我们不会自动获取整份存档或设备诊断日志。如排查需要进一步信息，我们会先说明用途和范围，您可以拒绝提供，拒绝不会影响离线游玩。您也可以仅咨询而不发送附件。</w:t>
       </w:r>
     </w:p>
     <w:p>
@@ -1990,45 +2204,45 @@
           <w:lang w:val="en-US" w:eastAsia="zh-CN"/>
           <w:color w:val="000000"/>
         </w:rPr>
-        <w:t xml:space="preserve">4 权限及当前未开展的处理</w:t>
-      </w:r>
-    </w:p>
-    <w:p>
-      <w:pPr>
-        <w:adjustRightInd w:val="0"/>
-        <w:snapToGrid w:val="0"/>
-        <w:spacing w:before="0" w:after="156" w:afterLines="50" w:line="360" w:lineRule="auto"/>
-        <w:rPr>
-          <w:rFonts w:ascii="Times New Roman" w:hAnsi="Times New Roman" w:eastAsia="华文仿宋" w:cs="Times New Roman"/>
-        </w:rPr>
-        <w:widowControl w:val="1"/>
-      </w:pPr>
-      <w:r>
-        <w:rPr>
-          <w:rFonts w:hint="eastAsia" w:ascii="Times New Roman" w:hAnsi="Times New Roman" w:eastAsia="华文仿宋" w:cs="Times New Roman"/>
-          <w:lang w:eastAsia="zh-CN"/>
-          <w:color w:val="000000"/>
-        </w:rPr>
-        <w:t xml:space="preserve">当前 Android 0.7.1 发布包没有声明网络、定位、相机、麦克风、通讯录、电话状态或共享存储读取权限，不存在相应的运行时授权流程。读写本应用私有目录不需要授予共享存储权限；Windows 版仅使用操作系统赋予该程序的本机运行和文件读写能力。</w:t>
-      </w:r>
-    </w:p>
-    <w:p>
-      <w:pPr>
-        <w:adjustRightInd w:val="0"/>
-        <w:snapToGrid w:val="0"/>
-        <w:spacing w:before="0" w:after="156" w:afterLines="50" w:line="360" w:lineRule="auto"/>
-        <w:rPr>
-          <w:rFonts w:ascii="Times New Roman" w:hAnsi="Times New Roman" w:eastAsia="华文仿宋" w:cs="Times New Roman"/>
-        </w:rPr>
-        <w:widowControl w:val="1"/>
-      </w:pPr>
-      <w:r>
-        <w:rPr>
-          <w:rFonts w:hint="eastAsia" w:ascii="Times New Roman" w:hAnsi="Times New Roman" w:eastAsia="华文仿宋" w:cs="Times New Roman"/>
-          <w:lang w:eastAsia="zh-CN"/>
-          <w:color w:val="000000"/>
-        </w:rPr>
-        <w:t xml:space="preserve">当前游戏不设置在线账号、实名认证、多人联网、充值支付、广告、个性化营销或云存档；不通过游戏主动采集手机号、身份证件、联系人、照片、录音、精确位置、IMEI、IMSI、MAC、OAID 或广告标识符；未接入自动上传崩溃信息、用户行为统计或广告归因服务。将来如增加此类功能，会在处理开始前更新说明并履行适用的告知与同意义务。</w:t>
+        <w:t xml:space="preserve">4 隐私网页的网络请求</w:t>
+      </w:r>
+    </w:p>
+    <w:p>
+      <w:pPr>
+        <w:adjustRightInd w:val="0"/>
+        <w:snapToGrid w:val="0"/>
+        <w:spacing w:before="0" w:after="156" w:afterLines="50" w:line="360" w:lineRule="auto"/>
+        <w:rPr>
+          <w:rFonts w:ascii="Times New Roman" w:hAnsi="Times New Roman" w:eastAsia="华文仿宋" w:cs="Times New Roman"/>
+        </w:rPr>
+        <w:widowControl w:val="1"/>
+      </w:pPr>
+      <w:r>
+        <w:rPr>
+          <w:rFonts w:hint="eastAsia" w:ascii="Times New Roman" w:hAnsi="Times New Roman" w:eastAsia="华文仿宋" w:cs="Times New Roman"/>
+          <w:lang w:eastAsia="zh-CN"/>
+          <w:color w:val="000000"/>
+        </w:rPr>
+        <w:t xml:space="preserve">您使用浏览器访问本政策网页时，浏览器会向 Vercel 托管服务发出请求。为传输页面和防范攻击，服务会处理 IP 地址、请求时间、请求 URL、浏览器发送的请求头及系统配置等技术信息，并可能依据 IP 推断城市或国家等大致地域；这不是游戏获取 GPS 精确定位。页面未启用 Vercel Web Analytics、Speed Insights、广告追踪或其他访问统计脚本，也不提供收集信息的在线表单。</w:t>
+      </w:r>
+    </w:p>
+    <w:p>
+      <w:pPr>
+        <w:adjustRightInd w:val="0"/>
+        <w:snapToGrid w:val="0"/>
+        <w:spacing w:before="0" w:after="156" w:afterLines="50" w:line="360" w:lineRule="auto"/>
+        <w:rPr>
+          <w:rFonts w:ascii="Times New Roman" w:hAnsi="Times New Roman" w:eastAsia="华文仿宋" w:cs="Times New Roman"/>
+        </w:rPr>
+        <w:widowControl w:val="1"/>
+      </w:pPr>
+      <w:r>
+        <w:rPr>
+          <w:rFonts w:hint="eastAsia" w:ascii="Times New Roman" w:hAnsi="Times New Roman" w:eastAsia="华文仿宋" w:cs="Times New Roman"/>
+          <w:lang w:eastAsia="zh-CN"/>
+          <w:color w:val="000000"/>
+        </w:rPr>
+        <w:t xml:space="preserve">只在您打开网页时发生上述网络处理；离线启动游戏不等同于访问网页。请勿把个人信息写入网页 URL 查询参数。网站访问技术信息不会与您的游戏进度、阵容或战绩关联。</w:t>
       </w:r>
     </w:p>
     <w:p>
@@ -2054,26 +2268,90 @@
           <w:lang w:val="en-US" w:eastAsia="zh-CN"/>
           <w:color w:val="000000"/>
         </w:rPr>
-        <w:t xml:space="preserve">5 使用依据与目的限制</w:t>
-      </w:r>
-    </w:p>
-    <w:p>
-      <w:pPr>
-        <w:adjustRightInd w:val="0"/>
-        <w:snapToGrid w:val="0"/>
-        <w:spacing w:before="0" w:after="156" w:afterLines="50" w:line="360" w:lineRule="auto"/>
-        <w:rPr>
-          <w:rFonts w:ascii="Times New Roman" w:hAnsi="Times New Roman" w:eastAsia="华文仿宋" w:cs="Times New Roman"/>
-        </w:rPr>
-        <w:widowControl w:val="1"/>
-      </w:pPr>
-      <w:r>
-        <w:rPr>
-          <w:rFonts w:hint="eastAsia" w:ascii="Times New Roman" w:hAnsi="Times New Roman" w:eastAsia="华文仿宋" w:cs="Times New Roman"/>
-          <w:lang w:eastAsia="zh-CN"/>
-          <w:color w:val="000000"/>
-        </w:rPr>
-        <w:t xml:space="preserve">本机文件用于您选择使用的离线游戏功能；您自愿发送的联系信息仅用于处理该次咨询、故障或权利请求；网页技术信息用于交付页面及必要的安全维护。我们不会将这些信息用于广告画像、出售、自动化定价或 AI 模型训练。需要另作使用时，我们会重新履行适用的告知和同意义务；无需同意的处理仅限法律明确规定的范围，不因本政策而扩大。</w:t>
+        <w:t xml:space="preserve">5 权限及当前未开展的处理</w:t>
+      </w:r>
+    </w:p>
+    <w:p>
+      <w:pPr>
+        <w:adjustRightInd w:val="0"/>
+        <w:snapToGrid w:val="0"/>
+        <w:spacing w:before="0" w:after="156" w:afterLines="50" w:line="360" w:lineRule="auto"/>
+        <w:rPr>
+          <w:rFonts w:ascii="Times New Roman" w:hAnsi="Times New Roman" w:eastAsia="华文仿宋" w:cs="Times New Roman"/>
+        </w:rPr>
+        <w:widowControl w:val="1"/>
+      </w:pPr>
+      <w:r>
+        <w:rPr>
+          <w:rFonts w:hint="eastAsia" w:ascii="Times New Roman" w:hAnsi="Times New Roman" w:eastAsia="华文仿宋" w:cs="Times New Roman"/>
+          <w:lang w:eastAsia="zh-CN"/>
+          <w:color w:val="000000"/>
+        </w:rPr>
+        <w:t xml:space="preserve">Android 0.8.0 发布包声明 INTERNET 网络权限，仅用于您选择的联机服务器通信；这是系统正常权限，没有运行时授权弹窗。未声明定位、相机、麦克风、通讯录、电话状态或共享存储读取权限。应用只在自己的私有目录读写文件，并通过 Android Keystore 保护匿名身份密钥。Windows 版使用原生网络与本机文件能力，以及当前 Windows 用户的 DPAPI 保护身份密钥。</w:t>
+      </w:r>
+    </w:p>
+    <w:p>
+      <w:pPr>
+        <w:adjustRightInd w:val="0"/>
+        <w:snapToGrid w:val="0"/>
+        <w:spacing w:before="0" w:after="156" w:afterLines="50" w:line="360" w:lineRule="auto"/>
+        <w:rPr>
+          <w:rFonts w:ascii="Times New Roman" w:hAnsi="Times New Roman" w:eastAsia="华文仿宋" w:cs="Times New Roman"/>
+        </w:rPr>
+        <w:widowControl w:val="1"/>
+      </w:pPr>
+      <w:r>
+        <w:rPr>
+          <w:rFonts w:hint="eastAsia" w:ascii="Times New Roman" w:hAnsi="Times New Roman" w:eastAsia="华文仿宋" w:cs="Times New Roman"/>
+          <w:lang w:eastAsia="zh-CN"/>
+          <w:color w:val="000000"/>
+        </w:rPr>
+        <w:t xml:space="preserve">本版联机使用随机匿名身份，不要求姓名、手机号、邮箱、身份证件、社交账号或实名认证信息；不采集联系人、照片、录音、精确位置、IMEI、IMSI、MAC、OAID 或广告标识符。游戏没有充值支付、广告、个性化营销、行为统计、自动上传崩溃日志或单机云存档服务。</w:t>
+      </w:r>
+    </w:p>
+    <w:p>
+      <w:pPr>
+        <w:pStyle w:val="19"/>
+        <w:adjustRightInd w:val="0"/>
+        <w:snapToGrid w:val="0"/>
+        <w:spacing w:after="156" w:afterLines="50" w:line="360" w:lineRule="auto"/>
+        <w:ind w:firstLineChars="0"/>
+        <w:rPr>
+          <w:rFonts w:ascii="Times New Roman" w:hAnsi="Times New Roman" w:eastAsia="华文仿宋" w:cs="Times New Roman"/>
+          <w:b/>
+          <w:bCs/>
+        </w:rPr>
+        <w:widowControl w:val="1"/>
+        <w:keepNext w:val="1"/>
+      </w:pPr>
+      <w:r>
+        <w:rPr>
+          <w:rFonts w:hint="eastAsia" w:ascii="Times New Roman" w:hAnsi="Times New Roman" w:eastAsia="华文仿宋" w:cs="Times New Roman"/>
+          <w:b/>
+          <w:bCs/>
+          <w:lang w:val="en-US" w:eastAsia="zh-CN"/>
+          <w:color w:val="000000"/>
+        </w:rPr>
+        <w:t xml:space="preserve">6 使用依据与目的限制</w:t>
+      </w:r>
+    </w:p>
+    <w:p>
+      <w:pPr>
+        <w:adjustRightInd w:val="0"/>
+        <w:snapToGrid w:val="0"/>
+        <w:spacing w:before="0" w:after="156" w:afterLines="50" w:line="360" w:lineRule="auto"/>
+        <w:rPr>
+          <w:rFonts w:ascii="Times New Roman" w:hAnsi="Times New Roman" w:eastAsia="华文仿宋" w:cs="Times New Roman"/>
+        </w:rPr>
+        <w:widowControl w:val="1"/>
+      </w:pPr>
+      <w:r>
+        <w:rPr>
+          <w:rFonts w:hint="eastAsia" w:ascii="Times New Roman" w:hAnsi="Times New Roman" w:eastAsia="华文仿宋" w:cs="Times New Roman"/>
+          <w:lang w:eastAsia="zh-CN"/>
+          <w:color w:val="000000"/>
+        </w:rPr>
+        <w:t xml:space="preserve">本机文件用于离线进度、设置与本机恢复；您主动选择联机时的必要信息用于匿名身份验证、匹配、服务端裁判、反重复指令和原局恢复；自愿发送的联系信息用于处理对应咨询或权利请求；网页技术信息用于交付与安全维护。我们不将这些信息用于广告画像、出售、自动化定价或 AI 模型训练。另作使用时会履行适用的告知与同意义务，无需同意的处理仅限法律明确规定的范围。</w:t>
       </w:r>
     </w:p>
     <w:p>
@@ -2150,25 +2428,6 @@
     </w:p>
     <w:p>
       <w:pPr>
-        <w:adjustRightInd w:val="0"/>
-        <w:snapToGrid w:val="0"/>
-        <w:spacing w:before="0" w:after="156" w:afterLines="50" w:line="360" w:lineRule="auto"/>
-        <w:rPr>
-          <w:rFonts w:ascii="Times New Roman" w:hAnsi="Times New Roman" w:eastAsia="华文仿宋" w:cs="Times New Roman"/>
-        </w:rPr>
-        <w:widowControl w:val="1"/>
-      </w:pPr>
-      <w:r>
-        <w:rPr>
-          <w:rFonts w:hint="eastAsia" w:ascii="Times New Roman" w:hAnsi="Times New Roman" w:eastAsia="华文仿宋" w:cs="Times New Roman"/>
-          <w:lang w:eastAsia="zh-CN"/>
-          <w:color w:val="000000"/>
-        </w:rPr>
-        <w:t xml:space="preserve">Android 当前发布包的 allowBackup 为 false，未启用标准 Android 自动备份。本机目录保护依赖操作系统和设备安全，本机 JSON 存档没有另外加密。您自行复制、同步或交给设备厂商备份工具的副本，由您及所使用工具的规则决定；开发者不能远程删除这些副本。Windows 删除可执行文件或安装目录通常不会同时清除用户数据目录。</w:t>
-      </w:r>
-    </w:p>
-    <w:p>
-      <w:pPr>
         <w:pStyle w:val="19"/>
         <w:adjustRightInd w:val="0"/>
         <w:snapToGrid w:val="0"/>
@@ -2190,26 +2449,83 @@
           <w:lang w:val="en-US" w:eastAsia="zh-CN"/>
           <w:color w:val="000000"/>
         </w:rPr>
-        <w:t xml:space="preserve">2 主动联系信息的保存</w:t>
-      </w:r>
-    </w:p>
-    <w:p>
-      <w:pPr>
-        <w:adjustRightInd w:val="0"/>
-        <w:snapToGrid w:val="0"/>
-        <w:spacing w:before="0" w:after="156" w:afterLines="50" w:line="360" w:lineRule="auto"/>
-        <w:rPr>
-          <w:rFonts w:ascii="Times New Roman" w:hAnsi="Times New Roman" w:eastAsia="华文仿宋" w:cs="Times New Roman"/>
-        </w:rPr>
-        <w:widowControl w:val="1"/>
-      </w:pPr>
-      <w:r>
-        <w:rPr>
-          <w:rFonts w:hint="eastAsia" w:ascii="Times New Roman" w:hAnsi="Times New Roman" w:eastAsia="华文仿宋" w:cs="Times New Roman"/>
-          <w:lang w:eastAsia="zh-CN"/>
-          <w:color w:val="000000"/>
-        </w:rPr>
-        <w:t xml:space="preserve">我们仅在解决咨询、处理故障或隐私请求所必需的最短期间保留您主动提供的信息。用途完成、不再必要或依法应删除时，我们将删除或对必要记录作匿名化处理，不将附件长期积累为玩家资料库。法律明确要求保留的记录，仅在法定期限内保存并限制其他使用。</w:t>
+        <w:t xml:space="preserve">2 联机身份与服务端保存</w:t>
+      </w:r>
+    </w:p>
+    <w:p>
+      <w:pPr>
+        <w:adjustRightInd w:val="0"/>
+        <w:snapToGrid w:val="0"/>
+        <w:spacing w:before="0" w:after="156" w:afterLines="50" w:line="360" w:lineRule="auto"/>
+        <w:rPr>
+          <w:rFonts w:ascii="Times New Roman" w:hAnsi="Times New Roman" w:eastAsia="华文仿宋" w:cs="Times New Roman"/>
+        </w:rPr>
+        <w:widowControl w:val="1"/>
+      </w:pPr>
+      <w:r>
+        <w:rPr>
+          <w:rFonts w:hint="eastAsia" w:ascii="Times New Roman" w:hAnsi="Times New Roman" w:eastAsia="华文仿宋" w:cs="Times New Roman"/>
+          <w:lang w:eastAsia="zh-CN"/>
+          <w:color w:val="000000"/>
+        </w:rPr>
+        <w:t xml:space="preserve">客户端将服务器地址、联机构筑、当前在线对局编号及尚未确认指令序号保存在本机 online-session.json。Windows 匿名身份密钥存入 DPAPI 保护文件；Android 存入 Keystore 密钥保护的加密应用偏好。短期访问令牌只在客户端内存保存。清除应用数据、卸载或删除受保护凭据后，可能无法再证明原匿名身份，也无法取回原席位；本版没有跨设备找回或账号绑定功能。</w:t>
+      </w:r>
+    </w:p>
+    <w:p>
+      <w:pPr>
+        <w:adjustRightInd w:val="0"/>
+        <w:snapToGrid w:val="0"/>
+        <w:spacing w:before="0" w:after="156" w:afterLines="50" w:line="360" w:lineRule="auto"/>
+        <w:rPr>
+          <w:rFonts w:ascii="Times New Roman" w:hAnsi="Times New Roman" w:eastAsia="华文仿宋" w:cs="Times New Roman"/>
+        </w:rPr>
+        <w:widowControl w:val="1"/>
+      </w:pPr>
+      <w:r>
+        <w:rPr>
+          <w:rFonts w:hint="eastAsia" w:ascii="Times New Roman" w:hAnsi="Times New Roman" w:eastAsia="华文仿宋" w:cs="Times New Roman"/>
+          <w:lang w:eastAsia="zh-CN"/>
+          <w:color w:val="000000"/>
+        </w:rPr>
+        <w:t xml:space="preserve">随本项目交付的服务端默认保存期限：访问令牌有效 15 分钟、一次性 WebSocket 票据有效 30 秒，过期后由定时任务清理；请求幂等记录保留 24 小时；已结束对局的指令、检查点、结果与关联房间最长保留 30 天；无活动关联且 90 天未使用的匿名身份进入定时清理。活动对局的数据保留到结束，以完成裁判与故障恢复。清理按分钟批次执行，并非到期瞬间物理擦除；法律另有要求时依法处理。</w:t>
+      </w:r>
+    </w:p>
+    <w:p>
+      <w:pPr>
+        <w:adjustRightInd w:val="0"/>
+        <w:snapToGrid w:val="0"/>
+        <w:spacing w:before="0" w:after="156" w:afterLines="50" w:line="360" w:lineRule="auto"/>
+        <w:rPr>
+          <w:rFonts w:ascii="Times New Roman" w:hAnsi="Times New Roman" w:eastAsia="华文仿宋" w:cs="Times New Roman"/>
+        </w:rPr>
+        <w:widowControl w:val="1"/>
+      </w:pPr>
+      <w:r>
+        <w:rPr>
+          <w:rFonts w:hint="eastAsia" w:ascii="Times New Roman" w:hAnsi="Times New Roman" w:eastAsia="华文仿宋" w:cs="Times New Roman"/>
+          <w:lang w:eastAsia="zh-CN"/>
+          <w:color w:val="000000"/>
+        </w:rPr>
+        <w:t xml:space="preserve">等待房间通常在五分钟后到期，最长十分钟；结束房间码有 90 秒冷却。匹配/房间时间限制用于保持服务状态，不代表服务器备份在同一时刻删除。具体存放国家或地区、数据库备份保留期及反向代理日志规则取决于实际部署；自行部署或第三方服务器应向您提供对应说明。当前 Release 未附带公共匹配服务地址，不能把 Vercel 隐私网页的托管地点当成游戏对战数据存放地点。</w:t>
+      </w:r>
+    </w:p>
+    <w:p>
+      <w:pPr>
+        <w:adjustRightInd w:val="0"/>
+        <w:snapToGrid w:val="0"/>
+        <w:spacing w:before="0" w:after="156" w:afterLines="50" w:line="360" w:lineRule="auto"/>
+        <w:rPr>
+          <w:rFonts w:ascii="Times New Roman" w:hAnsi="Times New Roman" w:eastAsia="华文仿宋" w:cs="Times New Roman"/>
+        </w:rPr>
+        <w:widowControl w:val="1"/>
+      </w:pPr>
+      <w:r>
+        <w:rPr>
+          <w:rFonts w:hint="eastAsia" w:ascii="Times New Roman" w:hAnsi="Times New Roman" w:eastAsia="华文仿宋" w:cs="Times New Roman"/>
+          <w:lang w:eastAsia="zh-CN"/>
+          <w:color w:val="000000"/>
+        </w:rPr>
+        <w:t xml:space="preserve">Android 当前发布包的 allowBackup 为 false，未启用标准 Android 自动备份。本机目录保护依赖操作系统和设备安全，本机 JSON 存档没有另外加密。您自行复制、同步或交给设备厂商备份工具的副本，由您及所使用工具的规则决定；开发者不能远程删除这些副本。Windows 删除可执行文件或安装目录通常不会同时清除用户数据目录。</w:t>
       </w:r>
     </w:p>
     <w:p>
@@ -2235,7 +2551,52 @@
           <w:lang w:val="en-US" w:eastAsia="zh-CN"/>
           <w:color w:val="000000"/>
         </w:rPr>
-        <w:t xml:space="preserve">3 网页托管地点与第三方保存</w:t>
+        <w:t xml:space="preserve">3 主动联系信息的保存</w:t>
+      </w:r>
+    </w:p>
+    <w:p>
+      <w:pPr>
+        <w:adjustRightInd w:val="0"/>
+        <w:snapToGrid w:val="0"/>
+        <w:spacing w:before="0" w:after="156" w:afterLines="50" w:line="360" w:lineRule="auto"/>
+        <w:rPr>
+          <w:rFonts w:ascii="Times New Roman" w:hAnsi="Times New Roman" w:eastAsia="华文仿宋" w:cs="Times New Roman"/>
+        </w:rPr>
+        <w:widowControl w:val="1"/>
+      </w:pPr>
+      <w:r>
+        <w:rPr>
+          <w:rFonts w:hint="eastAsia" w:ascii="Times New Roman" w:hAnsi="Times New Roman" w:eastAsia="华文仿宋" w:cs="Times New Roman"/>
+          <w:lang w:eastAsia="zh-CN"/>
+          <w:color w:val="000000"/>
+        </w:rPr>
+        <w:t xml:space="preserve">我们仅在解决咨询、处理故障或隐私请求所必需的最短期间保留您主动提供的信息。用途完成、不再必要或依法应删除时，我们将删除或对必要记录作匿名化处理，不将附件长期积累为玩家资料库。法律明确要求保留的记录，仅在法定期限内保存并限制其他使用。</w:t>
+      </w:r>
+    </w:p>
+    <w:p>
+      <w:pPr>
+        <w:pStyle w:val="19"/>
+        <w:adjustRightInd w:val="0"/>
+        <w:snapToGrid w:val="0"/>
+        <w:spacing w:after="156" w:afterLines="50" w:line="360" w:lineRule="auto"/>
+        <w:ind w:firstLineChars="0"/>
+        <w:rPr>
+          <w:rFonts w:ascii="Times New Roman" w:hAnsi="Times New Roman" w:eastAsia="华文仿宋" w:cs="Times New Roman"/>
+          <w:b/>
+          <w:bCs/>
+        </w:rPr>
+        <w:widowControl w:val="1"/>
+        <w:keepNext w:val="1"/>
+      </w:pPr>
+      <w:r>
+        <w:rPr>
+          <w:rFonts w:hint="eastAsia" w:ascii="Times New Roman" w:hAnsi="Times New Roman" w:eastAsia="华文仿宋" w:cs="Times New Roman"/>
+          <w:b/>
+          <w:bCs/>
+          <w:lang w:val="en-US" w:eastAsia="zh-CN"/>
+          <w:color w:val="000000"/>
+        </w:rPr>
+        <w:t xml:space="preserve">4 网页托管地点与第三方保存</w:t>
       </w:r>
     </w:p>
     <w:p>
@@ -2429,7 +2790,7 @@
           <w:lang w:eastAsia="zh-CN"/>
           <w:color w:val="000000"/>
         </w:rPr>
-        <w:t xml:space="preserve">当前游戏没有将本机进度或玩家标识共享给广告商、统计平台或账号服务商的功能。Vercel 为网页传输与安全处理必要技术信息；您选择发送邮件时，相关邮箱服务商处理邮件传输及保存。本政策第五节说明实际服务及适用范围；这些服务不会因此获得您未主动发送的游戏存档。</w:t>
+        <w:t xml:space="preserve">本机进度不共享给广告商或统计平台。您选择联机时，所选服务器运营者处理对战所需数据，对手接收匿名身份与公开战局信息，不接收私有资源、队列或身份密钥。服务器运营者与网页托管提供者是不同角色；Vercel 为隐私网页传输与安全处理必要技术信息，相关邮箱服务商仅在您选择联系时传递与保存邮件。</w:t>
       </w:r>
     </w:p>
     <w:p>
@@ -3137,7 +3498,7 @@
           <w:lang w:eastAsia="zh-CN"/>
           <w:color w:val="000000"/>
         </w:rPr>
-        <w:t xml:space="preserve">我们通过减少收集、本机保存、不集成玩家信息采集 SDK、限制问题反馈的用途和范围，以及使用 HTTPS 提供本隐私网页等方式降低不必要的数据暴露。涉及联系信息时，仅在处理对应请求所需范围内访问，不将邮件附件公开或另作营销。</w:t>
+        <w:t xml:space="preserve">我们通过限制采集范围、本机保存离线进度、公网 HTTPS/WSS、匿名密钥系统保护、服务器凭据哈希与短期令牌、双席位身份核验、私有战局过滤和唯一结算等措施降低风险。本项目默认日志不记录身份密钥或访问令牌。数据库持久提交及检查点用于服务故障恢复；单台服务主机或磁盘损坏的恢复仍依赖运营者备份与部署，不能保证任何故障下都不丢失数据。</w:t>
       </w:r>
     </w:p>
     <w:p>
@@ -3247,7 +3608,7 @@
           <w:lang w:eastAsia="zh-CN"/>
           <w:color w:val="000000"/>
         </w:rPr>
-        <w:t xml:space="preserve">您可以在游戏中查看已显示的战役进度、英雄、圣物、阵容和设置，并调整可修改的设置。对于您通过联系渠道向我们提供的个人信息，可以请求查阅、复制、更正、补充，或要求我们解释处理规则。当前版本没有在线账号、玩家云端档案或游戏内数据导出按钮。</w:t>
+        <w:t xml:space="preserve">您可以在游戏中查看战役进度、英雄、圣物、构筑与设置，联机时查看当前房间、席位和对战结果，并调整可修改内容。对于我们实际持有的联系信息或由我们运营服务处理的联机信息，可以请求查阅、复制、更正、补充或解释。当前版本没有游戏内数据导出、账号绑定、云存档或自助删除服务器身份按钮。</w:t>
       </w:r>
     </w:p>
     <w:p>
@@ -3311,26 +3672,26 @@
           <w:lang w:eastAsia="zh-CN"/>
           <w:color w:val="000000"/>
         </w:rPr>
-        <w:t xml:space="preserve">Windows：先退出游戏，在文件资源管理器地址栏输入 %APPDATA%\Godot\app_userdata\Epoch Rush- Pixel Command，清除本游戏目录中的 profile.json、settings.json、match.json 及对应 .bak、.tmp 文件；如需一并清除诊断日志，可删除该目录内的 logs 子目录，或删除整个本游戏用户数据目录。该路径针对当前标准配置；系统账户、便携配置或将来版本改变目录时，可联系开发者确认。仅删除 EXE 或游戏安装目录不会自动删除这类用户数据。</w:t>
-      </w:r>
-    </w:p>
-    <w:p>
-      <w:pPr>
-        <w:adjustRightInd w:val="0"/>
-        <w:snapToGrid w:val="0"/>
-        <w:spacing w:before="0" w:after="156" w:afterLines="50" w:line="360" w:lineRule="auto"/>
-        <w:rPr>
-          <w:rFonts w:ascii="Times New Roman" w:hAnsi="Times New Roman" w:eastAsia="华文仿宋" w:cs="Times New Roman"/>
-        </w:rPr>
-        <w:widowControl w:val="1"/>
-      </w:pPr>
-      <w:r>
-        <w:rPr>
-          <w:rFonts w:hint="eastAsia" w:ascii="Times New Roman" w:hAnsi="Times New Roman" w:eastAsia="华文仿宋" w:cs="Times New Roman"/>
-          <w:lang w:eastAsia="zh-CN"/>
-          <w:color w:val="000000"/>
-        </w:rPr>
-        <w:t xml:space="preserve">清除数据会使本机进度和设置重置，开发者没有云存档可以为您恢复。删除前如需保留进度，可自行备份文件；请同时管理您自己创建的副本。当前游戏没有专门的游戏内“清除存档”或“注销账号”按钮。</w:t>
+        <w:t xml:space="preserve">Windows：先退出游戏，在文件资源管理器地址栏输入 %APPDATA%\Godot\app_userdata\Epoch Rush- Pixel Command，删除本游戏用户数据目录可一并清除单机进度、设置、日志、联机构筑、会话信息及 Windows 受保护身份文件。仅删除 EXE 或安装目录不会自动清除用户数据。也可只删除 profile.json、settings.json、match.json 及备份来清除单机进度，保留联机身份。路径随当前标准配置而定，变更系统账户或便携配置时可联系我们核对。</w:t>
+      </w:r>
+    </w:p>
+    <w:p>
+      <w:pPr>
+        <w:adjustRightInd w:val="0"/>
+        <w:snapToGrid w:val="0"/>
+        <w:spacing w:before="0" w:after="156" w:afterLines="50" w:line="360" w:lineRule="auto"/>
+        <w:rPr>
+          <w:rFonts w:ascii="Times New Roman" w:hAnsi="Times New Roman" w:eastAsia="华文仿宋" w:cs="Times New Roman"/>
+        </w:rPr>
+        <w:widowControl w:val="1"/>
+      </w:pPr>
+      <w:r>
+        <w:rPr>
+          <w:rFonts w:hint="eastAsia" w:ascii="Times New Roman" w:hAnsi="Times New Roman" w:eastAsia="华文仿宋" w:cs="Times New Roman"/>
+          <w:lang w:eastAsia="zh-CN"/>
+          <w:color w:val="000000"/>
+        </w:rPr>
+        <w:t xml:space="preserve">清除本机数据会重置进度与设置，并可能使您失去匿名身份、原在线席位和恢复能力。我们没有单机云存档可恢复进度；删除本机文件不会自动删除服务器记录。如需删除我们实际持有的联机数据，请联系隐私邮箱；使用他人服务器时联系其运营者。请同时管理自行备份的副本。</w:t>
       </w:r>
     </w:p>
     <w:p>
@@ -3356,26 +3717,26 @@
           <w:lang w:val="en-US" w:eastAsia="zh-CN"/>
           <w:color w:val="000000"/>
         </w:rPr>
-        <w:t xml:space="preserve">3 删除联系信息与撤回同意</w:t>
-      </w:r>
-    </w:p>
-    <w:p>
-      <w:pPr>
-        <w:adjustRightInd w:val="0"/>
-        <w:snapToGrid w:val="0"/>
-        <w:spacing w:before="0" w:after="156" w:afterLines="50" w:line="360" w:lineRule="auto"/>
-        <w:rPr>
-          <w:rFonts w:ascii="Times New Roman" w:hAnsi="Times New Roman" w:eastAsia="华文仿宋" w:cs="Times New Roman"/>
-        </w:rPr>
-        <w:widowControl w:val="1"/>
-      </w:pPr>
-      <w:r>
-        <w:rPr>
-          <w:rFonts w:hint="eastAsia" w:ascii="Times New Roman" w:hAnsi="Times New Roman" w:eastAsia="华文仿宋" w:cs="Times New Roman"/>
-          <w:lang w:eastAsia="zh-CN"/>
-          <w:color w:val="000000"/>
-        </w:rPr>
-        <w:t xml:space="preserve">您可以通过隐私联系邮箱请求删除主动提供的邮件或附件，并撤回基于同意进行的处理。撤回不影响撤回前依法进行的处理，也不会影响不需要该信息的离线游戏功能。若法律要求保留部分记录或删除在技术上暂时难以实现，我们会说明依据，并依法停止必要保存和安全措施以外的处理。没有在线账号意味着无需完成账号注销步骤。</w:t>
+        <w:t xml:space="preserve">3 删除信息与停止联机使用</w:t>
+      </w:r>
+    </w:p>
+    <w:p>
+      <w:pPr>
+        <w:adjustRightInd w:val="0"/>
+        <w:snapToGrid w:val="0"/>
+        <w:spacing w:before="0" w:after="156" w:afterLines="50" w:line="360" w:lineRule="auto"/>
+        <w:rPr>
+          <w:rFonts w:ascii="Times New Roman" w:hAnsi="Times New Roman" w:eastAsia="华文仿宋" w:cs="Times New Roman"/>
+        </w:rPr>
+        <w:widowControl w:val="1"/>
+      </w:pPr>
+      <w:r>
+        <w:rPr>
+          <w:rFonts w:hint="eastAsia" w:ascii="Times New Roman" w:hAnsi="Times New Roman" w:eastAsia="华文仿宋" w:cs="Times New Roman"/>
+          <w:lang w:eastAsia="zh-CN"/>
+          <w:color w:val="000000"/>
+        </w:rPr>
+        <w:t xml:space="preserve">您可以停止联机使用，并通过隐私联系邮箱请求删除我们持有的联机身份、对战记录、主动提供的邮件或附件，或撤回基于同意进行的处理。撤回不影响此前依法开展的处理，也不影响不需要该信息的离线游戏。删除活动对局中的身份可能影响双方比赛，应先结束或核实当前活动；需依法保留或暂时难以删除的部分，我们会说明依据并依法限制处理。</w:t>
       </w:r>
     </w:p>
     <w:p>
@@ -3420,7 +3781,7 @@
           <w:lang w:eastAsia="zh-CN"/>
           <w:color w:val="000000"/>
         </w:rPr>
-        <w:t xml:space="preserve">发送邮件至 carzyg@outlook.com，说明希望行使的权利、相关联系邮件的大致时间及必要的定位信息即可。建议直接使用原发件地址发送，以便核验。我们不会把提供身份证件作为一般请求的前提；仅在确有必要时采用与请求风险相称的最少信息核验。监护人代儿童提出请求时，可能需要必要的监护关系说明，但不应提交与请求无关的证件内容。</w:t>
+        <w:t xml:space="preserve">发送邮件至 carzyg@outlook.com，说明要行使的权利、所用服务器地址及必要的匿名玩家/对局编号，或联系邮件的大致时间。不要发送身份密钥、访问令牌、系统密码或身份证件；我们会根据请求采用相称的最少信息核验。我们无法替不受我们控制的服务器直接删除数据，会说明应联系的实际运营者。监护人请求可能需要必要的关系说明，请避免无关证件内容。</w:t>
       </w:r>
     </w:p>
     <w:p>
@@ -3485,7 +3846,7 @@
           <w:lang w:eastAsia="zh-CN"/>
           <w:color w:val="000000"/>
         </w:rPr>
-        <w:t xml:space="preserve">我们重视未成年人的隐私保护。未成年人请在监护人指导下阅读本政策，并合理安排游戏时间。当前版本不通过在线账号、实名认证或年龄画像收集未成年人的身份信息，也不通过游戏向未成年人展示个性化广告。</w:t>
+        <w:t xml:space="preserve">未成年人请在监护人指导下阅读本政策并合理安排游戏时间。本版不采集年龄、实名或身份画像，也不向未成年人展示个性化广告；随机匿名联机身份仍可能关联网络与对战活动。监护人应评估所选服务器的运营者和隐私规则，未满十四周岁儿童使用涉及个人信息的在线服务应由监护人依适用规则处理相关同意。</w:t>
       </w:r>
     </w:p>
     <w:p>
@@ -3569,7 +3930,7 @@
           <w:lang w:eastAsia="zh-CN"/>
           <w:color w:val="000000"/>
         </w:rPr>
-        <w:t xml:space="preserve">我们会根据实际功能和适用规则更新本政策，在网页标明版本、更新和生效日期，并保留可核对的历史版本。请以您实际使用游戏版本对应的说明为准。当前政策版本为 ER-PRIVACY-2026-10-09，更新日期和生效日期均为 2026 年 10 月 9 日。</w:t>
+        <w:t xml:space="preserve">我们根据实际功能和适用规则更新本政策，并保留仓库历史版本。当前政策为 ER-PRIVACY-2026-10-11，更新与生效日期均为 2026 年 10 月 11 日，对应游戏 0.8.0。该版新增可选联机匿名身份、必要对战传输及 Android INTERNET 权限；0.7.x 离线客户端不会因网页更新自动增加联网功能或权限。</w:t>
       </w:r>
     </w:p>
     <w:p>

</xml_diff>

<commit_message>
Publish v0.8.1 public online service and verified native clients
</commit_message>
<xml_diff>
--- a/docs/privacy-policy/纪元急袭隐私政策.docx
+++ b/docs/privacy-policy/纪元急袭隐私政策.docx
@@ -37,7 +37,7 @@
           <w:rFonts w:hint="eastAsia" w:ascii="华文仿宋" w:hAnsi="华文仿宋" w:eastAsia="华文仿宋" w:cs="Times New Roman"/>
           <w:color w:val="000000"/>
         </w:rPr>
-        <w:t xml:space="preserve">欢迎使用《纪元急袭》。我们重视您的隐私。本提示概括 Windows 与 Android 0.8.0 版本的信息处理方式，请同时阅读完整隐私政策。</w:t>
+        <w:t xml:space="preserve">欢迎使用《纪元急袭》。我们重视您的隐私。本提示概括 Windows 与 Android 0.8.1 版本的信息处理方式，请同时阅读完整隐私政策。</w:t>
       </w:r>
     </w:p>
     <w:p>
@@ -53,7 +53,7 @@
           <w:rFonts w:hint="eastAsia" w:ascii="华文仿宋" w:hAnsi="华文仿宋" w:eastAsia="华文仿宋" w:cs="Times New Roman"/>
           <w:color w:val="000000"/>
         </w:rPr>
-        <w:t xml:space="preserve">单人游戏可离线使用。本机进度、设置和单人存档不会自动上传。选择联机后，客户端连接您填写的对战服务器，创建随机匿名身份，并传输匹配、房间、构筑与对战数据以完成真人对战和断线恢复。</w:t>
+        <w:t xml:space="preserve">单人游戏可离线使用。本机进度、设置和单人存档不会自动上传。官方联机服务器为 https://jyqx-server.sidcloud.cn，由 SIDcloud 运营，位于新加坡。主动点击“同意并连接”后，客户端创建随机匿名身份，并传输必要网络信息、匹配、房间、构筑与对战数据，用于真人对战和断线恢复。仅进入联机页不会创建新的线上身份；已加入的对局可自动恢复。</w:t>
       </w:r>
     </w:p>
     <w:p>
@@ -85,7 +85,7 @@
           <w:rFonts w:hint="eastAsia" w:ascii="华文仿宋" w:hAnsi="华文仿宋" w:eastAsia="华文仿宋" w:cs="Times New Roman"/>
           <w:color w:val="000000"/>
         </w:rPr>
-        <w:t xml:space="preserve">Android 0.8.0 声明正常网络权限 INTERNET，用于您选择的联机功能；该权限不产生运行时授权弹窗。游戏没有定位、相机、麦克风、通讯录、电话或共享存储读取权限。</w:t>
+        <w:t xml:space="preserve">Android 0.8.1 声明正常网络权限 INTERNET，用于您选择的联机功能；该权限不产生运行时授权弹窗。游戏没有定位、相机、麦克风、通讯录、电话或共享存储读取权限。</w:t>
       </w:r>
     </w:p>
     <w:p>
@@ -117,7 +117,7 @@
           <w:rFonts w:hint="eastAsia" w:ascii="华文仿宋" w:hAnsi="华文仿宋" w:eastAsia="华文仿宋" w:cs="Times New Roman"/>
           <w:color w:val="000000"/>
         </w:rPr>
-        <w:t xml:space="preserve">联机数据由您选择的服务器运营者处理。使用自行部署或他人的服务端前，请确认其身份、所在地和隐私规则；当前 Release 不附带已部署的公共匹配服务。公网连接要求 HTTPS/WSS，明文 HTTP 只用于本机或私有局域网。</w:t>
+        <w:t xml:space="preserve">官方对战数据由 SIDcloud 在新加坡服务器处理。公网连接使用 HTTPS/WSS；反向代理不记录请求访问日志或含票据的 URL。选择自行部署或第三方服务器时，请先确认其运营者、所在地和隐私规则，明文 HTTP 仅供本机或私有局域网。</w:t>
       </w:r>
     </w:p>
     <w:p>
@@ -194,7 +194,7 @@
           <w:b/>
           <w:color w:val="000000"/>
         </w:rPr>
-        <w:t xml:space="preserve">政策版本：ER-PRIVACY-2026-10-11</w:t>
+        <w:t xml:space="preserve">政策版本：ER-PRIVACY-2026-10-11-PUBLIC</w:t>
       </w:r>
     </w:p>
     <w:p>
@@ -261,7 +261,7 @@
           <w:lang w:eastAsia="zh-CN"/>
           <w:color w:val="000000"/>
         </w:rPr>
-        <w:t xml:space="preserve">本政策适用于截至生效日《纪元急袭》Godot 原生 Windows 与 Android 0.8.0 版本及发布本政策的网页。英文名称为 Epoch Rush: Pixel Command，Android 包名为 studio.epochrush.pixelcommand。0.8.0 新增可选的真人联机功能；0.7.x 离线版本的信息处理方式请查阅仓库历史政策。使用他人部署的联机服务器时，该运营者独立承担其实际处理的信息保护责任，应另行向您告知规则。</w:t>
+        <w:t xml:space="preserve">本政策适用于截至生效日《纪元急袭》Godot 原生 Windows 与 Android 0.8.1 版本、SIDcloud 官方对战服务器及发布本政策的网页。英文名称为 Epoch Rush: Pixel Command，Android 包名为 studio.epochrush.pixelcommand。0.8.0 已加入可选真人联机，0.8.1 提供正式公共服务及明确的地区提示；0.7.x 离线版本的信息处理方式请查阅仓库历史政策。使用他人部署的服务端时，该运营者独立承担其实际信息保护责任。</w:t>
       </w:r>
     </w:p>
     <w:p>
@@ -2287,7 +2287,7 @@
           <w:lang w:eastAsia="zh-CN"/>
           <w:color w:val="000000"/>
         </w:rPr>
-        <w:t xml:space="preserve">Android 0.8.0 发布包声明 INTERNET 网络权限，仅用于您选择的联机服务器通信；这是系统正常权限，没有运行时授权弹窗。未声明定位、相机、麦克风、通讯录、电话状态或共享存储读取权限。应用只在自己的私有目录读写文件，并通过 Android Keystore 保护匿名身份密钥。Windows 版使用原生网络与本机文件能力，以及当前 Windows 用户的 DPAPI 保护身份密钥。</w:t>
+        <w:t xml:space="preserve">Android 0.8.1 发布包声明 INTERNET 网络权限，仅用于您选择的联机服务器通信；这是系统正常权限，没有运行时授权弹窗。未声明定位、相机、麦克风、通讯录、电话状态或共享存储读取权限。应用只在自己的私有目录读写文件，并通过 Android Keystore 保护匿名身份密钥。Windows 版使用原生网络与本机文件能力，以及当前 Windows 用户的 DPAPI 保护身份密钥。</w:t>
       </w:r>
     </w:p>
     <w:p>
@@ -2506,7 +2506,7 @@
           <w:lang w:eastAsia="zh-CN"/>
           <w:color w:val="000000"/>
         </w:rPr>
-        <w:t xml:space="preserve">等待房间通常在五分钟后到期，最长十分钟；结束房间码有 90 秒冷却。匹配/房间时间限制用于保持服务状态，不代表服务器备份在同一时刻删除。具体存放国家或地区、数据库备份保留期及反向代理日志规则取决于实际部署；自行部署或第三方服务器应向您提供对应说明。当前 Release 未附带公共匹配服务地址，不能把 Vercel 隐私网页的托管地点当成游戏对战数据存放地点。</w:t>
+        <w:t xml:space="preserve">官方联机服务器 https://jyqx-server.sidcloud.cn 位于新加坡，由 SIDcloud 运营；在线必要数据因此会传输至新加坡。单机进度仍留在本机。数据库使用独立账号和独立库；每日生成仅管理员可访问的本机备份，定时清理超过七天的备份，按每日任务执行可能保留至八天。服务诊断日志按大小和日期滚动，保留七份归档；不记录身份密钥、访问令牌或原始对战请求。代理访问日志关闭。自行部署或第三方服务器的位置、备份和日志规则由其运营者另行告知。隐私网页的 Vercel 托管地点与游戏服务器所在地是不同事项。</w:t>
       </w:r>
     </w:p>
     <w:p>
@@ -3930,7 +3930,7 @@
           <w:lang w:eastAsia="zh-CN"/>
           <w:color w:val="000000"/>
         </w:rPr>
-        <w:t xml:space="preserve">我们根据实际功能和适用规则更新本政策，并保留仓库历史版本。当前政策为 ER-PRIVACY-2026-10-11，更新与生效日期均为 2026 年 10 月 11 日，对应游戏 0.8.0。该版新增可选联机匿名身份、必要对战传输及 Android INTERNET 权限；0.7.x 离线客户端不会因网页更新自动增加联网功能或权限。</w:t>
+        <w:t xml:space="preserve">本次政策版本为 ER-PRIVACY-2026-10-11-PUBLIC，更新和生效日期均为 2026 年 10 月 11 日，对应游戏 0.8.1。本次补充 SIDcloud 官方服务器地址、新加坡存储地区、明确连接选择以及实际备份和日志规则。既有随机匿名身份和 Android INTERNET 权限继续用于可选联机；旧离线客户端不会因网页更新自动增加功能或权限。</w:t>
       </w:r>
     </w:p>
     <w:p>

</xml_diff>

<commit_message>
fix(online): auto-connect and unify the pixel lobby layout
</commit_message>
<xml_diff>
--- a/docs/privacy-policy/纪元急袭隐私政策.docx
+++ b/docs/privacy-policy/纪元急袭隐私政策.docx
@@ -37,7 +37,7 @@
           <w:rFonts w:hint="eastAsia" w:ascii="华文仿宋" w:hAnsi="华文仿宋" w:eastAsia="华文仿宋" w:cs="Times New Roman"/>
           <w:color w:val="000000"/>
         </w:rPr>
-        <w:t xml:space="preserve">欢迎使用《纪元急袭》。我们重视您的隐私。本提示概括 Windows 与 Android 0.8.1 版本的信息处理方式，请同时阅读完整隐私政策。</w:t>
+        <w:t xml:space="preserve">欢迎使用《纪元急袭》。我们重视您的隐私。本提示概括 Windows 与 Android 0.8.2 版本的信息处理方式，请同时阅读完整隐私政策。</w:t>
       </w:r>
     </w:p>
     <w:p>
@@ -53,7 +53,7 @@
           <w:rFonts w:hint="eastAsia" w:ascii="华文仿宋" w:hAnsi="华文仿宋" w:eastAsia="华文仿宋" w:cs="Times New Roman"/>
           <w:color w:val="000000"/>
         </w:rPr>
-        <w:t xml:space="preserve">单人游戏可离线使用。本机进度、设置和单人存档不会自动上传。官方联机服务器为 https://jyqx-server.sidcloud.cn，由 SIDcloud 运营，位于新加坡。主动点击“同意并连接”后，客户端创建随机匿名身份，并传输必要网络信息、匹配、房间、构筑与对战数据，用于真人对战和断线恢复。仅进入联机页不会创建新的线上身份；已加入的对局可自动恢复。</w:t>
+        <w:t xml:space="preserve">单人游戏可离线使用。本机进度、设置和单人存档不会自动上传。官方联机服务器为 https://jyqx-server.sidcloud.cn，由 SIDcloud 运营，位于新加坡。进入联机页即自动连接并创建或验证随机匿名身份，传输必要网络信息、匹配、房间、构筑与对战数据，用于真人对战和断线恢复。连接中断后自动定时重连，应用进入后台时暂停重试；存在尚未结束的在线对局时，重启应用可自动恢复原局。只使用单人模式且没有待恢复对局时，不会发起这类连接。</w:t>
       </w:r>
     </w:p>
     <w:p>
@@ -85,7 +85,7 @@
           <w:rFonts w:hint="eastAsia" w:ascii="华文仿宋" w:hAnsi="华文仿宋" w:eastAsia="华文仿宋" w:cs="Times New Roman"/>
           <w:color w:val="000000"/>
         </w:rPr>
-        <w:t xml:space="preserve">Android 0.8.1 声明正常网络权限 INTERNET，用于您选择的联机功能；该权限不产生运行时授权弹窗。游戏没有定位、相机、麦克风、通讯录、电话或共享存储读取权限。</w:t>
+        <w:t xml:space="preserve">Android 0.8.2 声明正常网络权限 INTERNET，用于您选择的联机功能；该权限不产生运行时授权弹窗。游戏没有定位、相机、麦克风、通讯录、电话或共享存储读取权限。</w:t>
       </w:r>
     </w:p>
     <w:p>
@@ -117,7 +117,7 @@
           <w:rFonts w:hint="eastAsia" w:ascii="华文仿宋" w:hAnsi="华文仿宋" w:eastAsia="华文仿宋" w:cs="Times New Roman"/>
           <w:color w:val="000000"/>
         </w:rPr>
-        <w:t xml:space="preserve">官方对战数据由 SIDcloud 在新加坡服务器处理。公网连接使用 HTTPS/WSS；反向代理不记录请求访问日志或含票据的 URL。选择自行部署或第三方服务器时，请先确认其运营者、所在地和隐私规则，明文 HTTP 仅供本机或私有局域网。</w:t>
+        <w:t xml:space="preserve">官方对战数据由 SIDcloud 在新加坡服务器处理。正式客户端使用固定连接配置，联机页不展示或提供修改服务器地址的入口。公网连接使用 HTTPS/WSS；反向代理不记录请求访问日志或含票据的 URL。自行修改源码并部署的服务，其运营者、所在地和隐私规则需另行确认。</w:t>
       </w:r>
     </w:p>
     <w:p>
@@ -194,7 +194,7 @@
           <w:b/>
           <w:color w:val="000000"/>
         </w:rPr>
-        <w:t xml:space="preserve">政策版本：ER-PRIVACY-2026-10-11-PUBLIC</w:t>
+        <w:t xml:space="preserve">政策版本：ER-PRIVACY-2026-10-11-AUTOCONNECT</w:t>
       </w:r>
     </w:p>
     <w:p>
@@ -261,7 +261,7 @@
           <w:lang w:eastAsia="zh-CN"/>
           <w:color w:val="000000"/>
         </w:rPr>
-        <w:t xml:space="preserve">本政策适用于截至生效日《纪元急袭》Godot 原生 Windows 与 Android 0.8.1 版本、SIDcloud 官方对战服务器及发布本政策的网页。英文名称为 Epoch Rush: Pixel Command，Android 包名为 studio.epochrush.pixelcommand。0.8.0 已加入可选真人联机，0.8.1 提供正式公共服务及明确的地区提示；0.7.x 离线版本的信息处理方式请查阅仓库历史政策。使用他人部署的服务端时，该运营者独立承担其实际信息保护责任。</w:t>
+        <w:t xml:space="preserve">本政策适用于截至生效日《纪元急袭》Godot 原生 Windows 与 Android 0.8.2 版本、SIDcloud 官方对战服务器及发布本政策的网页。英文名称为 Epoch Rush: Pixel Command，Android 包名为 studio.epochrush.pixelcommand。0.8.0 已加入可选真人联机，0.8.1 提供正式公共服务，0.8.2 调整为进入联机页自动连接及断开后定时重连；0.7.x 离线版本的信息处理方式请查阅仓库历史政策。自行改版并使用他人部署的服务端时，该运营者独立承担其实际信息保护责任。</w:t>
       </w:r>
     </w:p>
     <w:p>
@@ -1626,7 +1626,7 @@
                 <w:szCs w:val="20"/>
                 <w:color w:val="000000"/>
               </w:rPr>
-              <w:t>匹配、对战裁判与原局恢复；所选服务端</w:t>
+              <w:t>匹配、对战裁判与原局恢复；SIDcloud 官方服务器</w:t>
             </w:r>
           </w:p>
         </w:tc>
@@ -1661,7 +1661,7 @@
                 <w:szCs w:val="20"/>
                 <w:color w:val="000000"/>
               </w:rPr>
-              <w:t>选择连接后传输给所选服务器</w:t>
+              <w:t>进入联机页后传输</w:t>
             </w:r>
           </w:p>
         </w:tc>
@@ -2057,7 +2057,7 @@
           <w:lang w:eastAsia="zh-CN"/>
           <w:color w:val="000000"/>
         </w:rPr>
-        <w:t xml:space="preserve">您在联机菜单填写服务器地址并选择连接、创建房间或自由匹配时，客户端生成随机安装身份密钥并向该服务器验证，取得匿名玩家编号和短期访问令牌。密钥不是 IMEI、MAC、广告标识符或跨应用设备指纹；不同服务器分别保存身份凭据。首次连接会处理这些信息，您可选择只玩单机而不连接。已连接过的地址会保存在本机；存在尚未结束的在线对局时，重新启动应用会自动联系该服务器恢复原局。</w:t>
+        <w:t xml:space="preserve">您进入联机页时，客户端自动联系固定的 SIDcloud 官方服务，生成或读取随机安装身份密钥并完成验证，取得匿名玩家编号和短期访问令牌；随后可创建房间或自由匹配。密钥不是 IMEI、MAC、广告标识符或跨应用设备指纹。首次连接失败或连接中断时，客户端定时自动重试；应用进入后台后暂停重试，回到前台恢复连接。身份过期时自动重新验证，继续使用原匿名身份。您可选择只玩单机而不进入联机页；存在尚未结束的在线对局时，重新启动应用会自动联系官方服务恢复原局。正式客户端不保存可由玩家编辑的服务器地址。</w:t>
       </w:r>
     </w:p>
     <w:p>
@@ -2114,7 +2114,7 @@
           <w:lang w:eastAsia="zh-CN"/>
           <w:color w:val="000000"/>
         </w:rPr>
-        <w:t xml:space="preserve">联机只向您选择的服务器发送必要数据，不提供游戏内注册表单或单机云存档。联机菜单提供本政策链接及匿名身份用途说明。公网地址须为 HTTPS 并通过 WSS 传输战局；本机或私有局域网 HTTP 连接未额外加密，请仅在您信任的网络使用。结束对局后可停止联机使用；切换或清除服务器地址不等于删除该服务器已经保存的数据。</w:t>
+        <w:t xml:space="preserve">联机仅向固定官方服务发送必要数据，不提供游戏内注册表单或单机云存档。联机页提供本政策链接；隐私说明列明 SIDcloud 运营及数据在新加坡处理。公网通信使用 HTTPS 及 WSS。结束对局并退出应用可停止联机通信；退出联机页或卸载客户端不会自动删除服务器已经保存的数据。</w:t>
       </w:r>
     </w:p>
     <w:p>
@@ -2287,7 +2287,7 @@
           <w:lang w:eastAsia="zh-CN"/>
           <w:color w:val="000000"/>
         </w:rPr>
-        <w:t xml:space="preserve">Android 0.8.1 发布包声明 INTERNET 网络权限，仅用于您选择的联机服务器通信；这是系统正常权限，没有运行时授权弹窗。未声明定位、相机、麦克风、通讯录、电话状态或共享存储读取权限。应用只在自己的私有目录读写文件，并通过 Android Keystore 保护匿名身份密钥。Windows 版使用原生网络与本机文件能力，以及当前 Windows 用户的 DPAPI 保护身份密钥。</w:t>
+        <w:t xml:space="preserve">Android 0.8.2 发布包声明 INTERNET 网络权限，仅用于您选择的联机功能通信；这是系统正常权限，没有运行时授权弹窗。未声明定位、相机、麦克风、通讯录、电话状态或共享存储读取权限。应用只在自己的私有目录读写文件，并通过 Android Keystore 保护匿名身份密钥。Windows 版使用原生网络与本机文件能力，以及当前 Windows 用户的 DPAPI 保护身份密钥。</w:t>
       </w:r>
     </w:p>
     <w:p>
@@ -2468,7 +2468,7 @@
           <w:lang w:eastAsia="zh-CN"/>
           <w:color w:val="000000"/>
         </w:rPr>
-        <w:t xml:space="preserve">客户端将服务器地址、联机构筑、当前在线对局编号及尚未确认指令序号保存在本机 online-session.json。Windows 匿名身份密钥存入 DPAPI 保护文件；Android 存入 Keystore 密钥保护的加密应用偏好。短期访问令牌只在客户端内存保存。清除应用数据、卸载或删除受保护凭据后，可能无法再证明原匿名身份，也无法取回原席位；本版没有跨设备找回或账号绑定功能。</w:t>
+        <w:t xml:space="preserve">客户端将联机构筑、当前在线对局编号及尚未确认指令序号保存在本机 online-session.json。Windows 匿名身份密钥存入 DPAPI 保护文件；Android 存入 Keystore 密钥保护的加密应用偏好。短期访问令牌只在客户端内存保存。清除应用数据、卸载或删除受保护凭据后，可能无法再证明原匿名身份，也无法取回原席位；本版没有跨设备找回或账号绑定功能。</w:t>
       </w:r>
     </w:p>
     <w:p>
@@ -3781,7 +3781,7 @@
           <w:lang w:eastAsia="zh-CN"/>
           <w:color w:val="000000"/>
         </w:rPr>
-        <w:t xml:space="preserve">发送邮件至 carzyg@outlook.com，说明要行使的权利、所用服务器地址及必要的匿名玩家/对局编号，或联系邮件的大致时间。不要发送身份密钥、访问令牌、系统密码或身份证件；我们会根据请求采用相称的最少信息核验。我们无法替不受我们控制的服务器直接删除数据，会说明应联系的实际运营者。监护人请求可能需要必要的关系说明，请避免无关证件内容。</w:t>
+        <w:t xml:space="preserve">发送邮件至 carzyg@outlook.com，说明要行使的权利及必要的匿名玩家/对局编号，或联系邮件的大致时间。不要发送身份密钥、访问令牌、系统密码或身份证件；我们会根据请求采用相称的最少信息核验。我们无法替不受我们控制的服务器直接删除数据，会说明应联系的实际运营者。监护人请求可能需要必要的关系说明，请避免无关证件内容。</w:t>
       </w:r>
     </w:p>
     <w:p>
@@ -3930,7 +3930,7 @@
           <w:lang w:eastAsia="zh-CN"/>
           <w:color w:val="000000"/>
         </w:rPr>
-        <w:t xml:space="preserve">本次政策版本为 ER-PRIVACY-2026-10-11-PUBLIC，更新和生效日期均为 2026 年 10 月 11 日，对应游戏 0.8.1。本次补充 SIDcloud 官方服务器地址、新加坡存储地区、明确连接选择以及实际备份和日志规则。既有随机匿名身份和 Android INTERNET 权限继续用于可选联机；旧离线客户端不会因网页更新自动增加功能或权限。</w:t>
+        <w:t xml:space="preserve">本次政策版本为 ER-PRIVACY-2026-10-11-AUTOCONNECT，更新和生效日期均为 2026 年 10 月 11 日，对应游戏 0.8.2。本次说明进入联机页自动连接、连接中断定时重连、身份自动验证和固定连接配置的实际行为。SIDcloud 运营主体、新加坡存储地区以及备份、日志规则沿用既有公共服务说明。随机匿名身份和 Android INTERNET 权限继续用于可选联机；旧离线客户端不会因网页更新自动增加功能或权限。</w:t>
       </w:r>
     </w:p>
     <w:p>

</xml_diff>

<commit_message>
Migrate online service to Shanghai host and refresh privacy policy
</commit_message>
<xml_diff>
--- a/docs/privacy-policy/纪元急袭隐私政策.docx
+++ b/docs/privacy-policy/纪元急袭隐私政策.docx
@@ -53,7 +53,7 @@
           <w:rFonts w:hint="eastAsia" w:ascii="华文仿宋" w:hAnsi="华文仿宋" w:eastAsia="华文仿宋" w:cs="Times New Roman"/>
           <w:color w:val="000000"/>
         </w:rPr>
-        <w:t xml:space="preserve">单人游戏可离线使用。本机进度、设置和单人存档不会自动上传。官方联机服务器为 https://jyqx-server.sidcloud.cn，由 SIDcloud 运营，位于新加坡。进入联机页即自动连接并创建或验证随机匿名身份，传输必要网络信息、匹配、房间、构筑与对战数据，用于真人对战和断线恢复。连接中断后自动定时重连，应用进入后台时暂停重试；存在尚未结束的在线对局时，重启应用可自动恢复原局。只使用单人模式且没有待恢复对局时，不会发起这类连接。</w:t>
+        <w:t xml:space="preserve">单人游戏可离线使用。本机进度、设置和单人存档不会自动上传。官方联机服务器为 https://jyqx-server.sidcloud.cn，由 SIDcloud 运营，位于腾讯云中国（上海）。进入联机页即自动连接并创建或验证随机匿名身份，传输必要网络信息、匹配、房间、构筑与对战数据，用于真人对战和断线恢复。连接中断后自动定时重连，应用进入后台时暂停重试；存在尚未结束的在线对局时，重启应用可自动恢复原局。只使用单人模式且没有待恢复对局时，不会发起这类连接。</w:t>
       </w:r>
     </w:p>
     <w:p>
@@ -117,7 +117,7 @@
           <w:rFonts w:hint="eastAsia" w:ascii="华文仿宋" w:hAnsi="华文仿宋" w:eastAsia="华文仿宋" w:cs="Times New Roman"/>
           <w:color w:val="000000"/>
         </w:rPr>
-        <w:t xml:space="preserve">官方对战数据由 SIDcloud 在新加坡服务器处理。正式客户端使用固定连接配置，联机页不展示或提供修改服务器地址的入口。公网连接使用 HTTPS/WSS；反向代理不记录请求访问日志或含票据的 URL。自行修改源码并部署的服务，其运营者、所在地和隐私规则需另行确认。</w:t>
+        <w:t xml:space="preserve">官方对战数据由 SIDcloud 在腾讯云中国（上海）服务器处理。正式客户端使用固定连接配置，联机页不展示或提供修改服务器地址的入口。公网连接使用 HTTPS/WSS；反向代理不记录请求访问日志或含票据的 URL。自行修改源码并部署的服务，其运营者、所在地和隐私规则需另行确认。</w:t>
       </w:r>
     </w:p>
     <w:p>
@@ -154,7 +154,7 @@
           <w:b/>
           <w:color w:val="000000"/>
         </w:rPr>
-        <w:t xml:space="preserve">更新日期：2026年10月11日</w:t>
+        <w:t xml:space="preserve">更新日期：2026年10月12日</w:t>
       </w:r>
     </w:p>
     <w:p>
@@ -174,7 +174,7 @@
           <w:b/>
           <w:color w:val="000000"/>
         </w:rPr>
-        <w:t xml:space="preserve">生效日期：2026年10月11日</w:t>
+        <w:t xml:space="preserve">生效日期：2026年10月12日</w:t>
       </w:r>
     </w:p>
     <w:p>
@@ -194,7 +194,7 @@
           <w:b/>
           <w:color w:val="000000"/>
         </w:rPr>
-        <w:t xml:space="preserve">政策版本：ER-PRIVACY-2026-10-11-AUTOCONNECT</w:t>
+        <w:t xml:space="preserve">政策版本：ER-PRIVACY-2026-10-12-REGION-SHANGHAI</w:t>
       </w:r>
     </w:p>
     <w:p>
@@ -2114,7 +2114,7 @@
           <w:lang w:eastAsia="zh-CN"/>
           <w:color w:val="000000"/>
         </w:rPr>
-        <w:t xml:space="preserve">联机仅向固定官方服务发送必要数据，不提供游戏内注册表单或单机云存档。联机页提供本政策链接；隐私说明列明 SIDcloud 运营及数据在新加坡处理。公网通信使用 HTTPS 及 WSS。结束对局并退出应用可停止联机通信；退出联机页或卸载客户端不会自动删除服务器已经保存的数据。</w:t>
+        <w:t xml:space="preserve">联机仅向固定官方服务发送必要数据，不提供游戏内注册表单或单机云存档。联机页提供本政策链接；隐私说明列明 SIDcloud 运营及数据在腾讯云中国（上海）处理。公网通信使用 HTTPS 及 WSS。结束对局并退出应用可停止联机通信；退出联机页或卸载客户端不会自动删除服务器已经保存的数据。</w:t>
       </w:r>
     </w:p>
     <w:p>
@@ -2506,7 +2506,7 @@
           <w:lang w:eastAsia="zh-CN"/>
           <w:color w:val="000000"/>
         </w:rPr>
-        <w:t xml:space="preserve">官方联机服务器 https://jyqx-server.sidcloud.cn 位于新加坡，由 SIDcloud 运营；在线必要数据因此会传输至新加坡。单机进度仍留在本机。数据库使用独立账号和独立库；每日生成仅管理员可访问的本机备份，定时清理超过七天的备份，按每日任务执行可能保留至八天。服务诊断日志按大小和日期滚动，保留七份归档；不记录身份密钥、访问令牌或原始对战请求。代理访问日志关闭。自行部署或第三方服务器的位置、备份和日志规则由其运营者另行告知。隐私网页的 Vercel 托管地点与游戏服务器所在地是不同事项。</w:t>
+        <w:t xml:space="preserve">官方联机服务器 https://jyqx-server.sidcloud.cn 位于腾讯云中国（上海），由 SIDcloud 运营；在线必要数据因此会传输至腾讯云中国（上海）。单机进度仍留在本机。数据库使用独立账号和独立库；每日生成仅管理员可访问的本机备份，定时清理超过七天的备份，按每日任务执行可能保留至八天。服务诊断日志按大小和日期滚动，保留七份归档；不记录身份密钥、访问令牌或原始对战请求。代理访问日志关闭。自行部署或第三方服务器的位置、备份和日志规则由其运营者另行告知。隐私网页的 Vercel 托管地点与游戏服务器所在地是不同事项。</w:t>
       </w:r>
     </w:p>
     <w:p>
@@ -3930,7 +3930,7 @@
           <w:lang w:eastAsia="zh-CN"/>
           <w:color w:val="000000"/>
         </w:rPr>
-        <w:t xml:space="preserve">本次政策版本为 ER-PRIVACY-2026-10-11-AUTOCONNECT，更新和生效日期均为 2026 年 10 月 11 日，对应游戏 0.8.2。本次说明进入联机页自动连接、连接中断定时重连、身份自动验证和固定连接配置的实际行为。SIDcloud 运营主体、新加坡存储地区以及备份、日志规则沿用既有公共服务说明。随机匿名身份和 Android INTERNET 权限继续用于可选联机；旧离线客户端不会因网页更新自动增加功能或权限。</w:t>
+        <w:t xml:space="preserve">本次政策版本为 ER-PRIVACY-2026-10-12-REGION-SHANGHAI，更新和生效日期均为 2026 年 10 月 12 日，对应游戏 0.8.2。本次说明进入联机页自动连接、连接中断定时重连、身份自动验证和固定连接配置的实际行为。SIDcloud 运营主体、腾讯云中国（上海）存储地区以及备份、日志规则沿用既有公共服务说明。随机匿名身份和 Android INTERNET 权限继续用于可选联机；旧离线客户端不会因网页更新自动增加功能或权限。</w:t>
       </w:r>
     </w:p>
     <w:p>

</xml_diff>